<commit_message>
Improve KP copy: emphasize Doki, plain language, Forus blocks
Rewrite client-facing text without jargon abbreviations, expand
Doki.Logistics advantages, tilt comparison toward Doki, and add
company status blocks in Forus corporate style.

Co-authored-by: slitasov <slitasov@users.noreply.github.com>
</commit_message>
<xml_diff>
--- a/output/КП_1С-ЭПД_и_Доки_Логистика.docx
+++ b/output/КП_1С-ЭПД_и_Доки_Логистика.docx
@@ -5,7 +5,6 @@
     <w:tbl>
       <w:tblPr>
         <w:tblW w:type="auto" w:w="0"/>
-        <w:tblLayout w:type="autofit"/>
         <w:tblLook w:firstColumn="1" w:firstRow="1" w:lastColumn="0" w:lastRow="0" w:noHBand="0" w:noVBand="1" w:val="04A0"/>
       </w:tblPr>
       <w:tblGrid>
@@ -21,7 +20,7 @@
             <w:r>
               <w:drawing>
                 <wp:inline xmlns:a="http://schemas.openxmlformats.org/drawingml/2006/main" xmlns:pic="http://schemas.openxmlformats.org/drawingml/2006/picture">
-                  <wp:extent cx="1512000" cy="655807"/>
+                  <wp:extent cx="1440000" cy="624578"/>
                   <wp:docPr id="1" name="Picture 1"/>
                   <wp:cNvGraphicFramePr>
                     <a:graphicFrameLocks noChangeAspect="1"/>
@@ -42,7 +41,7 @@
                         <pic:spPr>
                           <a:xfrm>
                             <a:off x="0" y="0"/>
-                            <a:ext cx="1512000" cy="655807"/>
+                            <a:ext cx="1440000" cy="624578"/>
                           </a:xfrm>
                           <a:prstGeom prst="rect"/>
                         </pic:spPr>
@@ -60,7 +59,7 @@
           </w:tcPr>
           <w:p>
             <w:pPr>
-              <w:spacing w:before="120" w:after="0"/>
+              <w:spacing w:before="0" w:after="0"/>
               <w:jc w:val="right"/>
             </w:pPr>
             <w:r>
@@ -71,6 +70,21 @@
                 <w:sz w:val="18"/>
               </w:rPr>
               <w:t>Группа компаний «Форус»</w:t>
+            </w:r>
+          </w:p>
+          <w:p>
+            <w:pPr>
+              <w:spacing w:before="0" w:after="0"/>
+              <w:jc w:val="right"/>
+            </w:pPr>
+            <w:r>
+              <w:rPr>
+                <w:rFonts w:ascii="Arial" w:hAnsi="Arial" w:eastAsia="Arial"/>
+                <w:b w:val="0"/>
+                <w:color w:val="555555"/>
+                <w:sz w:val="18"/>
+              </w:rPr>
+              <w:t>Крупнейшая IT-компания Иркутской области</w:t>
             </w:r>
           </w:p>
           <w:p>
@@ -124,7 +138,7 @@
           <w:rFonts w:ascii="Arial" w:hAnsi="Arial" w:eastAsia="Arial"/>
           <w:b/>
           <w:color w:val="1E1E1E"/>
-          <w:sz w:val="36"/>
+          <w:sz w:val="34"/>
         </w:rPr>
         <w:t>КОММЕРЧЕСКОЕ ПРЕДЛОЖЕНИЕ</w:t>
       </w:r>
@@ -141,7 +155,7 @@
           <w:color w:val="555555"/>
           <w:sz w:val="22"/>
         </w:rPr>
-        <w:t>сервисы электронных перевозочных документов</w:t>
+        <w:t>Переход на электронные перевозочные документы</w:t>
       </w:r>
     </w:p>
     <w:p>
@@ -156,30 +170,46 @@
           <w:color w:val="1E1E1E"/>
           <w:sz w:val="26"/>
         </w:rPr>
-        <w:t>1С-ЭПД</w:t>
+        <w:t>Доки.Логистика</w:t>
       </w:r>
       <w:r>
         <w:rPr>
           <w:rFonts w:ascii="Arial" w:hAnsi="Arial" w:eastAsia="Arial"/>
           <w:b w:val="0"/>
-          <w:color w:val="E8B84A"/>
-          <w:sz w:val="26"/>
+          <w:color w:val="555555"/>
+          <w:sz w:val="24"/>
         </w:rPr>
-        <w:t xml:space="preserve">  ·  </w:t>
+        <w:t xml:space="preserve">  и  </w:t>
       </w:r>
       <w:r>
         <w:rPr>
           <w:rFonts w:ascii="Arial" w:hAnsi="Arial" w:eastAsia="Arial"/>
           <w:b/>
-          <w:color w:val="1E1E1E"/>
-          <w:sz w:val="26"/>
+          <w:color w:val="555555"/>
+          <w:sz w:val="24"/>
         </w:rPr>
-        <w:t>Доки.Логистика</w:t>
+        <w:t>1С-ЭПД</w:t>
       </w:r>
     </w:p>
     <w:p>
       <w:pPr>
-        <w:spacing w:after="160"/>
+        <w:spacing w:after="80" w:before="0" w:line="288" w:lineRule="auto"/>
+        <w:jc w:val="left"/>
+      </w:pPr>
+      <w:r>
+        <w:rPr>
+          <w:rFonts w:ascii="Arial" w:hAnsi="Arial" w:eastAsia="Arial"/>
+          <w:b/>
+          <w:color w:val="1E1E1E"/>
+          <w:sz w:val="22"/>
+        </w:rPr>
+        <w:t>Уважаемые коллеги!</w:t>
+      </w:r>
+    </w:p>
+    <w:p>
+      <w:pPr>
+        <w:spacing w:after="120" w:before="0" w:line="288" w:lineRule="auto"/>
+        <w:jc w:val="left"/>
       </w:pPr>
       <w:r>
         <w:rPr>
@@ -188,17 +218,14 @@
           <w:color w:val="1E1E1E"/>
           <w:sz w:val="20"/>
         </w:rPr>
-        <w:t xml:space="preserve">С 01.09.2026 г. вступает в силу Федеральный закон от 07.06.2025 № 140-ФЗ: переход на электронные перевозочные документы (ЭТрН, ЭЗЗ, экспедиторские документы, ЭПЛ) становится обязательным. ГК «Форус» предлагает два готовых решения для быстрого и законного старта обмена ЭПД — </w:t>
+        <w:t>Группа компаний «Форус» благодарит вас за интерес к нашим решениям и готовность выстроить удобный электронный документооборот по грузоперевозкам.</w:t>
       </w:r>
-      <w:r>
-        <w:rPr>
-          <w:rFonts w:ascii="Arial" w:hAnsi="Arial" w:eastAsia="Arial"/>
-          <w:b/>
-          <w:color w:val="1E1E1E"/>
-          <w:sz w:val="20"/>
-        </w:rPr>
-        <w:t>1С-ЭПД</w:t>
-      </w:r>
+    </w:p>
+    <w:p>
+      <w:pPr>
+        <w:spacing w:after="120" w:before="0" w:line="288" w:lineRule="auto"/>
+        <w:jc w:val="left"/>
+      </w:pPr>
       <w:r>
         <w:rPr>
           <w:rFonts w:ascii="Arial" w:hAnsi="Arial" w:eastAsia="Arial"/>
@@ -206,7 +233,22 @@
           <w:color w:val="1E1E1E"/>
           <w:sz w:val="20"/>
         </w:rPr>
-        <w:t xml:space="preserve"> и </w:t>
+        <w:t>С 1 сентября 2026 года вступает в силу Федеральный закон от 07.06.2025 № 140-ФЗ. Организации, которые участвуют в автомобильных грузоперевозках, переходят на электронные перевозочные документы: электронную транспортную накладную, электронный заказ-заявку, экспедиторские документы и электронный путевой лист (в установленных законом случаях). Бумажный обмен по этим документам больше не будет соответствовать требованиям законодательства.</w:t>
+      </w:r>
+    </w:p>
+    <w:p>
+      <w:pPr>
+        <w:spacing w:after="160" w:before="0" w:line="288" w:lineRule="auto"/>
+        <w:jc w:val="left"/>
+      </w:pPr>
+      <w:r>
+        <w:rPr>
+          <w:rFonts w:ascii="Arial" w:hAnsi="Arial" w:eastAsia="Arial"/>
+          <w:b w:val="0"/>
+          <w:color w:val="1E1E1E"/>
+          <w:sz w:val="20"/>
+        </w:rPr>
+        <w:t xml:space="preserve">Мы поможем вашей компании подключиться вовремя, без лишней нагрузки на бухгалтерию и логистику. Ниже — два решения, которые мы предлагаем. Наше приоритетное рекомендование для большинства клиентов — сервис </w:t>
       </w:r>
       <w:r>
         <w:rPr>
@@ -224,12 +266,12 @@
           <w:color w:val="1E1E1E"/>
           <w:sz w:val="20"/>
         </w:rPr>
-        <w:t>.</w:t>
+        <w:t>: он удобнее в ежедневной работе, гибче по сценариям и позволяет вести весь электронный документооборот в одном окне.</w:t>
       </w:r>
     </w:p>
     <w:p>
       <w:pPr>
-        <w:spacing w:before="280" w:after="120"/>
+        <w:spacing w:before="240" w:after="120"/>
         <w:pBdr>
           <w:bottom w:val="single" w:sz="18" w:space="4" w:color="E8B84A"/>
         </w:pBdr>
@@ -239,98 +281,42 @@
           <w:rFonts w:ascii="Arial" w:hAnsi="Arial" w:eastAsia="Arial"/>
           <w:b/>
           <w:color w:val="1E1E1E"/>
-          <w:sz w:val="28"/>
+          <w:sz w:val="26"/>
         </w:rPr>
-        <w:t>Плюсы каждого сервиса</w:t>
+        <w:t>Рекомендуем: Доки.Логистика</w:t>
       </w:r>
     </w:p>
     <w:tbl>
       <w:tblPr>
         <w:tblW w:type="auto" w:w="0"/>
-        <w:tblLayout w:type="autofit"/>
         <w:tblLook w:firstColumn="1" w:firstRow="1" w:lastColumn="0" w:lastRow="0" w:noHBand="0" w:noVBand="1" w:val="04A0"/>
         <w:tblBorders>
-          <w:top w:val="single" w:sz="10" w:space="0" w:color="E8B84A"/>
-          <w:left w:val="single" w:sz="10" w:space="0" w:color="E8B84A"/>
-          <w:bottom w:val="single" w:sz="10" w:space="0" w:color="E8B84A"/>
-          <w:right w:val="single" w:sz="10" w:space="0" w:color="E8B84A"/>
-          <w:insideH w:val="single" w:sz="10" w:space="0" w:color="E8B84A"/>
-          <w:insideV w:val="single" w:sz="10" w:space="0" w:color="E8B84A"/>
+          <w:top w:val="single" w:sz="12" w:space="0" w:color="E8B84A"/>
+          <w:left w:val="single" w:sz="12" w:space="0" w:color="E8B84A"/>
+          <w:bottom w:val="single" w:sz="12" w:space="0" w:color="E8B84A"/>
+          <w:right w:val="single" w:sz="12" w:space="0" w:color="E8B84A"/>
+          <w:insideH w:val="single" w:sz="12" w:space="0" w:color="E8B84A"/>
+          <w:insideV w:val="single" w:sz="12" w:space="0" w:color="E8B84A"/>
         </w:tblBorders>
       </w:tblPr>
       <w:tblGrid>
-        <w:gridCol w:w="5159"/>
-        <w:gridCol w:w="5159"/>
+        <w:gridCol w:w="10318"/>
       </w:tblGrid>
       <w:tr>
         <w:tc>
           <w:tcPr>
-            <w:tcW w:type="dxa" w:w="5159"/>
-            <w:shd w:fill="1E1E1E" w:val="clear"/>
+            <w:tcW w:type="dxa" w:w="10318"/>
+            <w:shd w:fill="FFF8E7" w:val="clear"/>
           </w:tcPr>
           <w:p>
-            <w:pPr>
-              <w:jc w:val="center"/>
-            </w:pPr>
             <w:r>
               <w:rPr>
                 <w:rFonts w:ascii="Arial" w:hAnsi="Arial" w:eastAsia="Arial"/>
                 <w:b/>
-                <w:color w:val="FFFFFF"/>
-                <w:sz w:val="18"/>
+                <w:color w:val="1E1E1E"/>
+                <w:sz w:val="22"/>
               </w:rPr>
-              <w:t>1С-ЭПД</w:t>
-            </w:r>
-          </w:p>
-        </w:tc>
-        <w:tc>
-          <w:tcPr>
-            <w:tcW w:type="dxa" w:w="5159"/>
-            <w:shd w:fill="1E1E1E" w:val="clear"/>
-          </w:tcPr>
-          <w:p>
-            <w:pPr>
-              <w:jc w:val="center"/>
-            </w:pPr>
-            <w:r>
-              <w:rPr>
-                <w:rFonts w:ascii="Arial" w:hAnsi="Arial" w:eastAsia="Arial"/>
-                <w:b/>
-                <w:color w:val="FFFFFF"/>
-                <w:sz w:val="18"/>
-              </w:rPr>
-              <w:t>Доки.Логистика</w:t>
-            </w:r>
-          </w:p>
-        </w:tc>
-      </w:tr>
-      <w:tr>
-        <w:tc>
-          <w:tcPr>
-            <w:tcW w:type="dxa" w:w="5159"/>
-            <w:shd w:fill="FFF8E7" w:val="clear"/>
-          </w:tcPr>
-          <w:p>
-            <w:pPr>
-              <w:spacing w:after="60" w:before="40"/>
-            </w:pPr>
-            <w:r>
-              <w:rPr>
-                <w:rFonts w:ascii="Arial" w:hAnsi="Arial" w:eastAsia="Arial"/>
-                <w:b/>
-                <w:color w:val="E8B84A"/>
-                <w:sz w:val="18"/>
-              </w:rPr>
-              <w:t xml:space="preserve">●  </w:t>
-            </w:r>
-            <w:r>
-              <w:rPr>
-                <w:rFonts w:ascii="Arial" w:hAnsi="Arial" w:eastAsia="Arial"/>
-                <w:b w:val="0"/>
-                <w:color w:val="1E1E1E"/>
-                <w:sz w:val="18"/>
-              </w:rPr>
-              <w:t>Встроено в типовые конфигурации 1С — без доп. расширений</w:t>
+              <w:t>Почему мы советуем начать именно с Доки.Логистика</w:t>
             </w:r>
           </w:p>
           <w:p>
@@ -353,7 +339,7 @@
                 <w:color w:val="1E1E1E"/>
                 <w:sz w:val="18"/>
               </w:rPr>
-              <w:t>Поддержка всех форматов ЭПД, требуемых ФНС</w:t>
+              <w:t>Сервис работает сразу в трёх средах: в программе 1С, в веб-кабинете через браузер и в мобильном приложении. Можно пользоваться всеми вариантами сразу или выбрать один — например, только телефон или только браузер.</w:t>
             </w:r>
           </w:p>
           <w:p>
@@ -376,7 +362,7 @@
                 <w:color w:val="1E1E1E"/>
                 <w:sz w:val="18"/>
               </w:rPr>
-              <w:t>Роуминг с другими операторами ИС ЭПД</w:t>
+              <w:t>Подходит компаниям без 1С, с редко обновляемой 1С, а также тем, у кого логист, водитель или руководитель склада не работают в учётной базе бухгалтера.</w:t>
             </w:r>
           </w:p>
           <w:p>
@@ -399,7 +385,7 @@
                 <w:color w:val="1E1E1E"/>
                 <w:sz w:val="18"/>
               </w:rPr>
-              <w:t>Мобильное подписание водителем (УКЭП) в ЭТрН</w:t>
+              <w:t>В одном сервисе — и перевозочные документы, и обычный электронный документооборот с контрагентами: счета, акты, универсальные передаточные документы, договоры.</w:t>
             </w:r>
           </w:p>
           <w:p>
@@ -422,7 +408,7 @@
                 <w:color w:val="1E1E1E"/>
                 <w:sz w:val="18"/>
               </w:rPr>
-              <w:t>Работа из привычной учётной системы 1С</w:t>
+              <w:t>Документы хранятся в защищённом облачном архиве. Даже если с компьютером или базой 1С что-то случится, история обмена не потеряется.</w:t>
             </w:r>
           </w:p>
           <w:p>
@@ -445,7 +431,7 @@
                 <w:color w:val="1E1E1E"/>
                 <w:sz w:val="18"/>
               </w:rPr>
-              <w:t>Бесплатная настройка рабочего места при покупке пакета от 1 000 титулов (акция)</w:t>
+              <w:t>Для новых клиентов действует промотариф: 3 месяца работы без ограничений по количеству отправок (при подключении пакета документов).</w:t>
             </w:r>
           </w:p>
           <w:p>
@@ -468,174 +454,7 @@
                 <w:color w:val="1E1E1E"/>
                 <w:sz w:val="18"/>
               </w:rPr>
-              <w:t>Можно начать с бесплатной конфигурации «1С:Клиент ЭДО»</w:t>
-            </w:r>
-          </w:p>
-        </w:tc>
-        <w:tc>
-          <w:tcPr>
-            <w:tcW w:type="dxa" w:w="5159"/>
-            <w:shd w:fill="F7F7FB" w:val="clear"/>
-          </w:tcPr>
-          <w:p>
-            <w:pPr>
-              <w:spacing w:after="60" w:before="40"/>
-            </w:pPr>
-            <w:r>
-              <w:rPr>
-                <w:rFonts w:ascii="Arial" w:hAnsi="Arial" w:eastAsia="Arial"/>
-                <w:b/>
-                <w:color w:val="E8B84A"/>
-                <w:sz w:val="18"/>
-              </w:rPr>
-              <w:t xml:space="preserve">●  </w:t>
-            </w:r>
-            <w:r>
-              <w:rPr>
-                <w:rFonts w:ascii="Arial" w:hAnsi="Arial" w:eastAsia="Arial"/>
-                <w:b w:val="0"/>
-                <w:color w:val="1E1E1E"/>
-                <w:sz w:val="18"/>
-              </w:rPr>
-              <w:t>Работа в 1С, веб-кабинете и мобильном приложении независимо</w:t>
-            </w:r>
-          </w:p>
-          <w:p>
-            <w:pPr>
-              <w:spacing w:after="60" w:before="40"/>
-            </w:pPr>
-            <w:r>
-              <w:rPr>
-                <w:rFonts w:ascii="Arial" w:hAnsi="Arial" w:eastAsia="Arial"/>
-                <w:b/>
-                <w:color w:val="E8B84A"/>
-                <w:sz w:val="18"/>
-              </w:rPr>
-              <w:t xml:space="preserve">●  </w:t>
-            </w:r>
-            <w:r>
-              <w:rPr>
-                <w:rFonts w:ascii="Arial" w:hAnsi="Arial" w:eastAsia="Arial"/>
-                <w:b w:val="0"/>
-                <w:color w:val="1E1E1E"/>
-                <w:sz w:val="18"/>
-              </w:rPr>
-              <w:t>ЭПД, УПД, акты, счета и договоры — все документы в одном сервисе</w:t>
-            </w:r>
-          </w:p>
-          <w:p>
-            <w:pPr>
-              <w:spacing w:after="60" w:before="40"/>
-            </w:pPr>
-            <w:r>
-              <w:rPr>
-                <w:rFonts w:ascii="Arial" w:hAnsi="Arial" w:eastAsia="Arial"/>
-                <w:b/>
-                <w:color w:val="E8B84A"/>
-                <w:sz w:val="18"/>
-              </w:rPr>
-              <w:t xml:space="preserve">●  </w:t>
-            </w:r>
-            <w:r>
-              <w:rPr>
-                <w:rFonts w:ascii="Arial" w:hAnsi="Arial" w:eastAsia="Arial"/>
-                <w:b w:val="0"/>
-                <w:color w:val="1E1E1E"/>
-                <w:sz w:val="18"/>
-              </w:rPr>
-              <w:t>Подходит без 1С, без ПК или при редко обновляемой 1С</w:t>
-            </w:r>
-          </w:p>
-          <w:p>
-            <w:pPr>
-              <w:spacing w:after="60" w:before="40"/>
-            </w:pPr>
-            <w:r>
-              <w:rPr>
-                <w:rFonts w:ascii="Arial" w:hAnsi="Arial" w:eastAsia="Arial"/>
-                <w:b/>
-                <w:color w:val="E8B84A"/>
-                <w:sz w:val="18"/>
-              </w:rPr>
-              <w:t xml:space="preserve">●  </w:t>
-            </w:r>
-            <w:r>
-              <w:rPr>
-                <w:rFonts w:ascii="Arial" w:hAnsi="Arial" w:eastAsia="Arial"/>
-                <w:b w:val="0"/>
-                <w:color w:val="1E1E1E"/>
-                <w:sz w:val="18"/>
-              </w:rPr>
-              <w:t>Облачный архив: документы не потеряются при сбое базы</w:t>
-            </w:r>
-          </w:p>
-          <w:p>
-            <w:pPr>
-              <w:spacing w:after="60" w:before="40"/>
-            </w:pPr>
-            <w:r>
-              <w:rPr>
-                <w:rFonts w:ascii="Arial" w:hAnsi="Arial" w:eastAsia="Arial"/>
-                <w:b/>
-                <w:color w:val="E8B84A"/>
-                <w:sz w:val="18"/>
-              </w:rPr>
-              <w:t xml:space="preserve">●  </w:t>
-            </w:r>
-            <w:r>
-              <w:rPr>
-                <w:rFonts w:ascii="Arial" w:hAnsi="Arial" w:eastAsia="Arial"/>
-                <w:b w:val="0"/>
-                <w:color w:val="1E1E1E"/>
-                <w:sz w:val="18"/>
-              </w:rPr>
-              <w:t>Разделение доступа по сотрудникам и подразделениям</w:t>
-            </w:r>
-          </w:p>
-          <w:p>
-            <w:pPr>
-              <w:spacing w:after="60" w:before="40"/>
-            </w:pPr>
-            <w:r>
-              <w:rPr>
-                <w:rFonts w:ascii="Arial" w:hAnsi="Arial" w:eastAsia="Arial"/>
-                <w:b/>
-                <w:color w:val="E8B84A"/>
-                <w:sz w:val="18"/>
-              </w:rPr>
-              <w:t xml:space="preserve">●  </w:t>
-            </w:r>
-            <w:r>
-              <w:rPr>
-                <w:rFonts w:ascii="Arial" w:hAnsi="Arial" w:eastAsia="Arial"/>
-                <w:b w:val="0"/>
-                <w:color w:val="1E1E1E"/>
-                <w:sz w:val="18"/>
-              </w:rPr>
-              <w:t>Промотариф: 3 месяца безлимита для новых клиентов</w:t>
-            </w:r>
-          </w:p>
-          <w:p>
-            <w:pPr>
-              <w:spacing w:after="60" w:before="40"/>
-            </w:pPr>
-            <w:r>
-              <w:rPr>
-                <w:rFonts w:ascii="Arial" w:hAnsi="Arial" w:eastAsia="Arial"/>
-                <w:b/>
-                <w:color w:val="E8B84A"/>
-                <w:sz w:val="18"/>
-              </w:rPr>
-              <w:t xml:space="preserve">●  </w:t>
-            </w:r>
-            <w:r>
-              <w:rPr>
-                <w:rFonts w:ascii="Arial" w:hAnsi="Arial" w:eastAsia="Arial"/>
-                <w:b w:val="0"/>
-                <w:color w:val="1E1E1E"/>
-                <w:sz w:val="18"/>
-              </w:rPr>
-              <w:t>Мобильное подписание водителем (ПЭП / УКЭП / Госключ)</w:t>
+              <w:t>Водитель может подписать документы с телефона: простой электронной подписью, усиленной квалифицированной электронной подписью или через Госключ.</w:t>
             </w:r>
           </w:p>
         </w:tc>
@@ -643,7 +462,22 @@
     </w:tbl>
     <w:p>
       <w:pPr>
-        <w:spacing w:before="280" w:after="120"/>
+        <w:spacing w:after="80" w:before="120" w:line="288" w:lineRule="auto"/>
+        <w:jc w:val="left"/>
+      </w:pPr>
+      <w:r>
+        <w:rPr>
+          <w:rFonts w:ascii="Arial" w:hAnsi="Arial" w:eastAsia="Arial"/>
+          <w:b w:val="0"/>
+          <w:color w:val="555555"/>
+          <w:sz w:val="18"/>
+        </w:rPr>
+        <w:t>Доки.Логистика — это сервис группы компаний «Астрал», надёжного оператора электронного документооборота. Подключение и сопровождение для вас выполняет ГК «Форус»: настройка, обучение, поддержка и подбор тарифа под ваш объём документов.</w:t>
+      </w:r>
+    </w:p>
+    <w:p>
+      <w:pPr>
+        <w:spacing w:before="240" w:after="120"/>
         <w:pBdr>
           <w:bottom w:val="single" w:sz="18" w:space="4" w:color="E8B84A"/>
         </w:pBdr>
@@ -653,9 +487,536 @@
           <w:rFonts w:ascii="Arial" w:hAnsi="Arial" w:eastAsia="Arial"/>
           <w:b/>
           <w:color w:val="1E1E1E"/>
-          <w:sz w:val="28"/>
+          <w:sz w:val="26"/>
         </w:rPr>
-        <w:t>Основные отличия</w:t>
+        <w:t>Доки.Логистика — возможности для вашей компании</w:t>
+      </w:r>
+    </w:p>
+    <w:p>
+      <w:pPr>
+        <w:spacing w:after="60" w:before="80" w:line="288" w:lineRule="auto"/>
+        <w:jc w:val="left"/>
+      </w:pPr>
+      <w:r>
+        <w:rPr>
+          <w:rFonts w:ascii="Arial" w:hAnsi="Arial" w:eastAsia="Arial"/>
+          <w:b/>
+          <w:color w:val="1E1E1E"/>
+          <w:sz w:val="20"/>
+        </w:rPr>
+        <w:t>Удобно бухгалтеру и логисту</w:t>
+      </w:r>
+    </w:p>
+    <w:p>
+      <w:pPr>
+        <w:spacing w:after="40"/>
+        <w:ind w:left="113"/>
+      </w:pPr>
+      <w:r>
+        <w:rPr>
+          <w:rFonts w:ascii="Arial" w:hAnsi="Arial" w:eastAsia="Arial"/>
+          <w:b/>
+          <w:color w:val="E8B84A"/>
+          <w:sz w:val="18"/>
+        </w:rPr>
+        <w:t xml:space="preserve">●  </w:t>
+      </w:r>
+      <w:r>
+        <w:rPr>
+          <w:rFonts w:ascii="Arial" w:hAnsi="Arial" w:eastAsia="Arial"/>
+          <w:b w:val="0"/>
+          <w:color w:val="1E1E1E"/>
+          <w:sz w:val="18"/>
+        </w:rPr>
+        <w:t>Из 1С документы уходят в электронный обмен в один клик — без выгрузки файлов и ручной пересылки.</w:t>
+      </w:r>
+    </w:p>
+    <w:p>
+      <w:pPr>
+        <w:spacing w:after="40"/>
+        <w:ind w:left="113"/>
+      </w:pPr>
+      <w:r>
+        <w:rPr>
+          <w:rFonts w:ascii="Arial" w:hAnsi="Arial" w:eastAsia="Arial"/>
+          <w:b/>
+          <w:color w:val="E8B84A"/>
+          <w:sz w:val="18"/>
+        </w:rPr>
+        <w:t xml:space="preserve">●  </w:t>
+      </w:r>
+      <w:r>
+        <w:rPr>
+          <w:rFonts w:ascii="Arial" w:hAnsi="Arial" w:eastAsia="Arial"/>
+          <w:b w:val="0"/>
+          <w:color w:val="1E1E1E"/>
+          <w:sz w:val="18"/>
+        </w:rPr>
+        <w:t>Входящие документы можно сразу превратить в учётные документы 1С: меньше расхождений в реквизитах и ручного ввода.</w:t>
+      </w:r>
+    </w:p>
+    <w:p>
+      <w:pPr>
+        <w:spacing w:after="40"/>
+        <w:ind w:left="113"/>
+      </w:pPr>
+      <w:r>
+        <w:rPr>
+          <w:rFonts w:ascii="Arial" w:hAnsi="Arial" w:eastAsia="Arial"/>
+          <w:b/>
+          <w:color w:val="E8B84A"/>
+          <w:sz w:val="18"/>
+        </w:rPr>
+        <w:t xml:space="preserve">●  </w:t>
+      </w:r>
+      <w:r>
+        <w:rPr>
+          <w:rFonts w:ascii="Arial" w:hAnsi="Arial" w:eastAsia="Arial"/>
+          <w:b w:val="0"/>
+          <w:color w:val="1E1E1E"/>
+          <w:sz w:val="18"/>
+        </w:rPr>
+        <w:t>Остаток пакета и статус тарифа видны прямо в 1С и в веб-кабинете.</w:t>
+      </w:r>
+    </w:p>
+    <w:p>
+      <w:pPr>
+        <w:spacing w:after="40"/>
+        <w:ind w:left="113"/>
+      </w:pPr>
+      <w:r>
+        <w:rPr>
+          <w:rFonts w:ascii="Arial" w:hAnsi="Arial" w:eastAsia="Arial"/>
+          <w:b/>
+          <w:color w:val="E8B84A"/>
+          <w:sz w:val="18"/>
+        </w:rPr>
+        <w:t xml:space="preserve">●  </w:t>
+      </w:r>
+      <w:r>
+        <w:rPr>
+          <w:rFonts w:ascii="Arial" w:hAnsi="Arial" w:eastAsia="Arial"/>
+          <w:b w:val="0"/>
+          <w:color w:val="1E1E1E"/>
+          <w:sz w:val="18"/>
+        </w:rPr>
+        <w:t>Руководитель может подписать документ из дома, командировки или с телефона — бухгалтеру не нужно ждать его у рабочего компьютера.</w:t>
+      </w:r>
+    </w:p>
+    <w:p>
+      <w:pPr>
+        <w:spacing w:after="60" w:before="80" w:line="288" w:lineRule="auto"/>
+        <w:jc w:val="left"/>
+      </w:pPr>
+      <w:r>
+        <w:rPr>
+          <w:rFonts w:ascii="Arial" w:hAnsi="Arial" w:eastAsia="Arial"/>
+          <w:b/>
+          <w:color w:val="1E1E1E"/>
+          <w:sz w:val="20"/>
+        </w:rPr>
+        <w:t>Гибкая работа без привязки к одному компьютеру</w:t>
+      </w:r>
+    </w:p>
+    <w:p>
+      <w:pPr>
+        <w:spacing w:after="40"/>
+        <w:ind w:left="113"/>
+      </w:pPr>
+      <w:r>
+        <w:rPr>
+          <w:rFonts w:ascii="Arial" w:hAnsi="Arial" w:eastAsia="Arial"/>
+          <w:b/>
+          <w:color w:val="E8B84A"/>
+          <w:sz w:val="18"/>
+        </w:rPr>
+        <w:t xml:space="preserve">●  </w:t>
+      </w:r>
+      <w:r>
+        <w:rPr>
+          <w:rFonts w:ascii="Arial" w:hAnsi="Arial" w:eastAsia="Arial"/>
+          <w:b w:val="0"/>
+          <w:color w:val="1E1E1E"/>
+          <w:sz w:val="18"/>
+        </w:rPr>
+        <w:t>Веб-кабинет синхронизирован с 1С: статусы документов обновляются сразу в обоих интерфейсах.</w:t>
+      </w:r>
+    </w:p>
+    <w:p>
+      <w:pPr>
+        <w:spacing w:after="40"/>
+        <w:ind w:left="113"/>
+      </w:pPr>
+      <w:r>
+        <w:rPr>
+          <w:rFonts w:ascii="Arial" w:hAnsi="Arial" w:eastAsia="Arial"/>
+          <w:b/>
+          <w:color w:val="E8B84A"/>
+          <w:sz w:val="18"/>
+        </w:rPr>
+        <w:t xml:space="preserve">●  </w:t>
+      </w:r>
+      <w:r>
+        <w:rPr>
+          <w:rFonts w:ascii="Arial" w:hAnsi="Arial" w:eastAsia="Arial"/>
+          <w:b w:val="0"/>
+          <w:color w:val="1E1E1E"/>
+          <w:sz w:val="18"/>
+        </w:rPr>
+        <w:t>Мобильное приложение позволяет водителю подтвердить погрузку и выгрузку на месте.</w:t>
+      </w:r>
+    </w:p>
+    <w:p>
+      <w:pPr>
+        <w:spacing w:after="40"/>
+        <w:ind w:left="113"/>
+      </w:pPr>
+      <w:r>
+        <w:rPr>
+          <w:rFonts w:ascii="Arial" w:hAnsi="Arial" w:eastAsia="Arial"/>
+          <w:b/>
+          <w:color w:val="E8B84A"/>
+          <w:sz w:val="18"/>
+        </w:rPr>
+        <w:t xml:space="preserve">●  </w:t>
+      </w:r>
+      <w:r>
+        <w:rPr>
+          <w:rFonts w:ascii="Arial" w:hAnsi="Arial" w:eastAsia="Arial"/>
+          <w:b w:val="0"/>
+          <w:color w:val="1E1E1E"/>
+          <w:sz w:val="18"/>
+        </w:rPr>
+        <w:t>Можно разделить доступ по сотрудникам и подразделениям: бухгалтер, логист и склад работают в своих зонах ответственности.</w:t>
+      </w:r>
+    </w:p>
+    <w:p>
+      <w:pPr>
+        <w:spacing w:after="40"/>
+        <w:ind w:left="113"/>
+      </w:pPr>
+      <w:r>
+        <w:rPr>
+          <w:rFonts w:ascii="Arial" w:hAnsi="Arial" w:eastAsia="Arial"/>
+          <w:b/>
+          <w:color w:val="E8B84A"/>
+          <w:sz w:val="18"/>
+        </w:rPr>
+        <w:t xml:space="preserve">●  </w:t>
+      </w:r>
+      <w:r>
+        <w:rPr>
+          <w:rFonts w:ascii="Arial" w:hAnsi="Arial" w:eastAsia="Arial"/>
+          <w:b w:val="0"/>
+          <w:color w:val="1E1E1E"/>
+          <w:sz w:val="18"/>
+        </w:rPr>
+        <w:t>Подходит, если бухгалтер не готов пускать логиста в основную базу 1С — обмен ведётся в отдельном удобном контуре.</w:t>
+      </w:r>
+    </w:p>
+    <w:p>
+      <w:pPr>
+        <w:spacing w:after="60" w:before="80" w:line="288" w:lineRule="auto"/>
+        <w:jc w:val="left"/>
+      </w:pPr>
+      <w:r>
+        <w:rPr>
+          <w:rFonts w:ascii="Arial" w:hAnsi="Arial" w:eastAsia="Arial"/>
+          <w:b/>
+          <w:color w:val="1E1E1E"/>
+          <w:sz w:val="20"/>
+        </w:rPr>
+        <w:t>Экономия и прозрачность</w:t>
+      </w:r>
+    </w:p>
+    <w:p>
+      <w:pPr>
+        <w:spacing w:after="40"/>
+        <w:ind w:left="113"/>
+      </w:pPr>
+      <w:r>
+        <w:rPr>
+          <w:rFonts w:ascii="Arial" w:hAnsi="Arial" w:eastAsia="Arial"/>
+          <w:b/>
+          <w:color w:val="E8B84A"/>
+          <w:sz w:val="18"/>
+        </w:rPr>
+        <w:t xml:space="preserve">●  </w:t>
+      </w:r>
+      <w:r>
+        <w:rPr>
+          <w:rFonts w:ascii="Arial" w:hAnsi="Arial" w:eastAsia="Arial"/>
+          <w:b w:val="0"/>
+          <w:color w:val="1E1E1E"/>
+          <w:sz w:val="18"/>
+        </w:rPr>
+        <w:t>Отправка электронного документа в несколько раз дешевле печати, конверта и курьерской доставки (для сравнения: бумажный документ часто обходится около 50 рублей).</w:t>
+      </w:r>
+    </w:p>
+    <w:p>
+      <w:pPr>
+        <w:spacing w:after="40"/>
+        <w:ind w:left="113"/>
+      </w:pPr>
+      <w:r>
+        <w:rPr>
+          <w:rFonts w:ascii="Arial" w:hAnsi="Arial" w:eastAsia="Arial"/>
+          <w:b/>
+          <w:color w:val="E8B84A"/>
+          <w:sz w:val="18"/>
+        </w:rPr>
+        <w:t xml:space="preserve">●  </w:t>
+      </w:r>
+      <w:r>
+        <w:rPr>
+          <w:rFonts w:ascii="Arial" w:hAnsi="Arial" w:eastAsia="Arial"/>
+          <w:b w:val="0"/>
+          <w:color w:val="1E1E1E"/>
+          <w:sz w:val="18"/>
+        </w:rPr>
+        <w:t>Статус документа всегда на виду: отправлен, получен, подписан, требуется действие.</w:t>
+      </w:r>
+    </w:p>
+    <w:p>
+      <w:pPr>
+        <w:spacing w:after="40"/>
+        <w:ind w:left="113"/>
+      </w:pPr>
+      <w:r>
+        <w:rPr>
+          <w:rFonts w:ascii="Arial" w:hAnsi="Arial" w:eastAsia="Arial"/>
+          <w:b/>
+          <w:color w:val="E8B84A"/>
+          <w:sz w:val="18"/>
+        </w:rPr>
+        <w:t xml:space="preserve">●  </w:t>
+      </w:r>
+      <w:r>
+        <w:rPr>
+          <w:rFonts w:ascii="Arial" w:hAnsi="Arial" w:eastAsia="Arial"/>
+          <w:b w:val="0"/>
+          <w:color w:val="1E1E1E"/>
+          <w:sz w:val="18"/>
+        </w:rPr>
+        <w:t>Быстрее закрываете период и ускоряете получение оплаты за счёт мгновенной доставки закрывающих документов.</w:t>
+      </w:r>
+    </w:p>
+    <w:p>
+      <w:pPr>
+        <w:spacing w:after="40"/>
+        <w:ind w:left="113"/>
+      </w:pPr>
+      <w:r>
+        <w:rPr>
+          <w:rFonts w:ascii="Arial" w:hAnsi="Arial" w:eastAsia="Arial"/>
+          <w:b/>
+          <w:color w:val="E8B84A"/>
+          <w:sz w:val="18"/>
+        </w:rPr>
+        <w:t xml:space="preserve">●  </w:t>
+      </w:r>
+      <w:r>
+        <w:rPr>
+          <w:rFonts w:ascii="Arial" w:hAnsi="Arial" w:eastAsia="Arial"/>
+          <w:b w:val="0"/>
+          <w:color w:val="1E1E1E"/>
+          <w:sz w:val="18"/>
+        </w:rPr>
+        <w:t>Чем больше пакет документов — тем ниже цена одной отправки. Неиспользованный остаток переносится при своевременном продлении.</w:t>
+      </w:r>
+    </w:p>
+    <w:p>
+      <w:pPr>
+        <w:spacing w:before="240" w:after="120"/>
+        <w:pBdr>
+          <w:bottom w:val="single" w:sz="18" w:space="4" w:color="E8B84A"/>
+        </w:pBdr>
+      </w:pPr>
+      <w:r>
+        <w:rPr>
+          <w:rFonts w:ascii="Arial" w:hAnsi="Arial" w:eastAsia="Arial"/>
+          <w:b/>
+          <w:color w:val="1E1E1E"/>
+          <w:sz w:val="26"/>
+        </w:rPr>
+        <w:t>Альтернатива: сервис 1С-ЭПД</w:t>
+      </w:r>
+    </w:p>
+    <w:p>
+      <w:pPr>
+        <w:spacing w:after="80" w:before="0" w:line="288" w:lineRule="auto"/>
+        <w:jc w:val="left"/>
+      </w:pPr>
+      <w:r>
+        <w:rPr>
+          <w:rFonts w:ascii="Arial" w:hAnsi="Arial" w:eastAsia="Arial"/>
+          <w:b w:val="0"/>
+          <w:color w:val="1E1E1E"/>
+          <w:sz w:val="20"/>
+        </w:rPr>
+        <w:t>1С-ЭПД — типовое решение фирмы «1С» для обмена электронными перевозочными документами внутри программ 1С. Оно хорошо подходит компаниям, которые уже активно работают в актуальной типовой 1С, регулярно обновляются и хотят вести перевозочный обмен прямо в учётной системе без отдельного веб-кабинета.</w:t>
+      </w:r>
+    </w:p>
+    <w:p>
+      <w:pPr>
+        <w:spacing w:after="40"/>
+      </w:pPr>
+      <w:r>
+        <w:rPr>
+          <w:rFonts w:ascii="Arial" w:hAnsi="Arial" w:eastAsia="Arial"/>
+          <w:b/>
+          <w:color w:val="555555"/>
+          <w:sz w:val="18"/>
+        </w:rPr>
+        <w:t xml:space="preserve">●  </w:t>
+      </w:r>
+      <w:r>
+        <w:rPr>
+          <w:rFonts w:ascii="Arial" w:hAnsi="Arial" w:eastAsia="Arial"/>
+          <w:b w:val="0"/>
+          <w:color w:val="1E1E1E"/>
+          <w:sz w:val="18"/>
+        </w:rPr>
+        <w:t>Встроено в типовые конфигурации 1С — отдельное расширение обычно не требуется.</w:t>
+      </w:r>
+    </w:p>
+    <w:p>
+      <w:pPr>
+        <w:spacing w:after="40"/>
+      </w:pPr>
+      <w:r>
+        <w:rPr>
+          <w:rFonts w:ascii="Arial" w:hAnsi="Arial" w:eastAsia="Arial"/>
+          <w:b/>
+          <w:color w:val="555555"/>
+          <w:sz w:val="18"/>
+        </w:rPr>
+        <w:t xml:space="preserve">●  </w:t>
+      </w:r>
+      <w:r>
+        <w:rPr>
+          <w:rFonts w:ascii="Arial" w:hAnsi="Arial" w:eastAsia="Arial"/>
+          <w:b w:val="0"/>
+          <w:color w:val="1E1E1E"/>
+          <w:sz w:val="18"/>
+        </w:rPr>
+        <w:t>Поддерживает форматы электронных перевозочных документов, которые требует налоговая служба.</w:t>
+      </w:r>
+    </w:p>
+    <w:p>
+      <w:pPr>
+        <w:spacing w:after="40"/>
+      </w:pPr>
+      <w:r>
+        <w:rPr>
+          <w:rFonts w:ascii="Arial" w:hAnsi="Arial" w:eastAsia="Arial"/>
+          <w:b/>
+          <w:color w:val="555555"/>
+          <w:sz w:val="18"/>
+        </w:rPr>
+        <w:t xml:space="preserve">●  </w:t>
+      </w:r>
+      <w:r>
+        <w:rPr>
+          <w:rFonts w:ascii="Arial" w:hAnsi="Arial" w:eastAsia="Arial"/>
+          <w:b w:val="0"/>
+          <w:color w:val="1E1E1E"/>
+          <w:sz w:val="18"/>
+        </w:rPr>
+        <w:t>Есть обмен с другими операторами электронных перевозочных документов.</w:t>
+      </w:r>
+    </w:p>
+    <w:p>
+      <w:pPr>
+        <w:spacing w:after="40"/>
+      </w:pPr>
+      <w:r>
+        <w:rPr>
+          <w:rFonts w:ascii="Arial" w:hAnsi="Arial" w:eastAsia="Arial"/>
+          <w:b/>
+          <w:color w:val="555555"/>
+          <w:sz w:val="18"/>
+        </w:rPr>
+        <w:t xml:space="preserve">●  </w:t>
+      </w:r>
+      <w:r>
+        <w:rPr>
+          <w:rFonts w:ascii="Arial" w:hAnsi="Arial" w:eastAsia="Arial"/>
+          <w:b w:val="0"/>
+          <w:color w:val="1E1E1E"/>
+          <w:sz w:val="18"/>
+        </w:rPr>
+        <w:t>Водитель может подписывать документы в мобильном приложении усиленной квалифицированной электронной подписью.</w:t>
+      </w:r>
+    </w:p>
+    <w:p>
+      <w:pPr>
+        <w:spacing w:after="40"/>
+      </w:pPr>
+      <w:r>
+        <w:rPr>
+          <w:rFonts w:ascii="Arial" w:hAnsi="Arial" w:eastAsia="Arial"/>
+          <w:b/>
+          <w:color w:val="555555"/>
+          <w:sz w:val="18"/>
+        </w:rPr>
+        <w:t xml:space="preserve">●  </w:t>
+      </w:r>
+      <w:r>
+        <w:rPr>
+          <w:rFonts w:ascii="Arial" w:hAnsi="Arial" w:eastAsia="Arial"/>
+          <w:b w:val="0"/>
+          <w:color w:val="1E1E1E"/>
+          <w:sz w:val="18"/>
+        </w:rPr>
+        <w:t>При покупке пакета от 1 000 документов действует акция: бесплатная настройка одного рабочего места.</w:t>
+      </w:r>
+    </w:p>
+    <w:p>
+      <w:pPr>
+        <w:spacing w:after="80" w:before="80" w:line="288" w:lineRule="auto"/>
+        <w:jc w:val="left"/>
+      </w:pPr>
+      <w:r>
+        <w:rPr>
+          <w:rFonts w:ascii="Arial" w:hAnsi="Arial" w:eastAsia="Arial"/>
+          <w:b w:val="0"/>
+          <w:color w:val="555555"/>
+          <w:sz w:val="18"/>
+        </w:rPr>
+        <w:t>Ограничение: мобильное приложение 1С-ЭПД сейчас работает в связке с 1С. Если у сотрудников нет постоянного доступа к базе 1С, им нужен только телефон или браузер, либо вы хотите совместить перевозочные и обычные документы в одном сервисе — удобнее выбрать Доки.Логистика.</w:t>
+      </w:r>
+    </w:p>
+    <w:p>
+      <w:pPr>
+        <w:spacing w:before="240" w:after="120"/>
+        <w:pBdr>
+          <w:bottom w:val="single" w:sz="18" w:space="4" w:color="E8B84A"/>
+        </w:pBdr>
+      </w:pPr>
+      <w:r>
+        <w:rPr>
+          <w:rFonts w:ascii="Arial" w:hAnsi="Arial" w:eastAsia="Arial"/>
+          <w:b/>
+          <w:color w:val="1E1E1E"/>
+          <w:sz w:val="26"/>
+        </w:rPr>
+        <w:t>Сравнение по возможностям</w:t>
+      </w:r>
+    </w:p>
+    <w:p>
+      <w:pPr>
+        <w:spacing w:after="80" w:before="0" w:line="288" w:lineRule="auto"/>
+        <w:jc w:val="left"/>
+      </w:pPr>
+      <w:r>
+        <w:rPr>
+          <w:rFonts w:ascii="Arial" w:hAnsi="Arial" w:eastAsia="Arial"/>
+          <w:b w:val="0"/>
+          <w:color w:val="555555"/>
+          <w:sz w:val="18"/>
+        </w:rPr>
+        <w:t>Ниже — наглядное сравнение. Мы специально выделили параметры, которые важны бухгалтерии, логистике и руководству в повседневной работе.</w:t>
       </w:r>
     </w:p>
     <w:tbl>
@@ -693,7 +1054,27 @@
                 <w:color w:val="FFFFFF"/>
                 <w:sz w:val="18"/>
               </w:rPr>
-              <w:t>Критерий</w:t>
+              <w:t>Что важно клиенту</w:t>
+            </w:r>
+          </w:p>
+        </w:tc>
+        <w:tc>
+          <w:tcPr>
+            <w:tcW w:type="dxa" w:w="3439"/>
+            <w:shd w:fill="1E1E1E" w:val="clear"/>
+          </w:tcPr>
+          <w:p>
+            <w:pPr>
+              <w:jc w:val="center"/>
+            </w:pPr>
+            <w:r>
+              <w:rPr>
+                <w:rFonts w:ascii="Arial" w:hAnsi="Arial" w:eastAsia="Arial"/>
+                <w:b/>
+                <w:color w:val="FFFFFF"/>
+                <w:sz w:val="18"/>
+              </w:rPr>
+              <w:t>Доки.Логистика</w:t>
             </w:r>
           </w:p>
         </w:tc>
@@ -717,32 +1098,12 @@
             </w:r>
           </w:p>
         </w:tc>
-        <w:tc>
-          <w:tcPr>
-            <w:tcW w:type="dxa" w:w="3439"/>
-            <w:shd w:fill="1E1E1E" w:val="clear"/>
-          </w:tcPr>
-          <w:p>
-            <w:pPr>
-              <w:jc w:val="center"/>
-            </w:pPr>
-            <w:r>
-              <w:rPr>
-                <w:rFonts w:ascii="Arial" w:hAnsi="Arial" w:eastAsia="Arial"/>
-                <w:b/>
-                <w:color w:val="FFFFFF"/>
-                <w:sz w:val="18"/>
-              </w:rPr>
-              <w:t>Доки.Логистика</w:t>
-            </w:r>
-          </w:p>
-        </w:tc>
       </w:tr>
       <w:tr>
         <w:tc>
           <w:tcPr>
             <w:tcW w:type="dxa" w:w="3439"/>
-            <w:shd w:fill="F5F5F5" w:val="clear"/>
+            <w:shd w:fill="F3F0FA" w:val="clear"/>
           </w:tcPr>
           <w:p>
             <w:pPr>
@@ -755,7 +1116,27 @@
                 <w:color w:val="1E1E1E"/>
                 <w:sz w:val="16"/>
               </w:rPr>
-              <w:t>Где работает</w:t>
+              <w:t>Где можно работать</w:t>
+            </w:r>
+          </w:p>
+        </w:tc>
+        <w:tc>
+          <w:tcPr>
+            <w:tcW w:type="dxa" w:w="3439"/>
+            <w:shd w:fill="F3F0FA" w:val="clear"/>
+          </w:tcPr>
+          <w:p>
+            <w:pPr>
+              <w:jc w:val="left"/>
+            </w:pPr>
+            <w:r>
+              <w:rPr>
+                <w:rFonts w:ascii="Arial" w:hAnsi="Arial" w:eastAsia="Arial"/>
+                <w:b w:val="0"/>
+                <w:color w:val="1E1E1E"/>
+                <w:sz w:val="16"/>
+              </w:rPr>
+              <w:t>В 1С, в браузере и в мобильном приложении — независимо друг от друга</w:t>
             </w:r>
           </w:p>
         </w:tc>
@@ -775,27 +1156,7 @@
                 <w:color w:val="1E1E1E"/>
                 <w:sz w:val="16"/>
               </w:rPr>
-              <w:t>Внутри типовой 1С (+ моб. приложение)</w:t>
-            </w:r>
-          </w:p>
-        </w:tc>
-        <w:tc>
-          <w:tcPr>
-            <w:tcW w:type="dxa" w:w="3439"/>
-            <w:shd w:fill="F5F5F5" w:val="clear"/>
-          </w:tcPr>
-          <w:p>
-            <w:pPr>
-              <w:jc w:val="left"/>
-            </w:pPr>
-            <w:r>
-              <w:rPr>
-                <w:rFonts w:ascii="Arial" w:hAnsi="Arial" w:eastAsia="Arial"/>
-                <w:b w:val="0"/>
-                <w:color w:val="1E1E1E"/>
-                <w:sz w:val="16"/>
-              </w:rPr>
-              <w:t>1С + веб + мобильное приложение</w:t>
+              <w:t>В основном внутри программы 1С (+ мобильное приложение в связке с 1С)</w:t>
             </w:r>
           </w:p>
         </w:tc>
@@ -817,7 +1178,7 @@
                 <w:color w:val="1E1E1E"/>
                 <w:sz w:val="16"/>
               </w:rPr>
-              <w:t>Кому подходит</w:t>
+              <w:t>Нужна ли 1С для старта</w:t>
             </w:r>
           </w:p>
         </w:tc>
@@ -837,7 +1198,7 @@
                 <w:color w:val="1E1E1E"/>
                 <w:sz w:val="16"/>
               </w:rPr>
-              <w:t>Учёт в 1С, регулярные обновления, уже есть 1С-ЭДО</w:t>
+              <w:t>Не обязательна: можно начать с веб-кабинета или телефона</w:t>
             </w:r>
           </w:p>
         </w:tc>
@@ -857,7 +1218,7 @@
                 <w:color w:val="1E1E1E"/>
                 <w:sz w:val="16"/>
               </w:rPr>
-              <w:t>Нет 1С / нет ПК / логисты вне базы / редкие обновления</w:t>
+              <w:t>Нужна база 1С (или бесплатная конфигурация «1С:Клиент ЭДО»)</w:t>
             </w:r>
           </w:p>
         </w:tc>
@@ -866,7 +1227,7 @@
         <w:tc>
           <w:tcPr>
             <w:tcW w:type="dxa" w:w="3439"/>
-            <w:shd w:fill="F5F5F5" w:val="clear"/>
+            <w:shd w:fill="F3F0FA" w:val="clear"/>
           </w:tcPr>
           <w:p>
             <w:pPr>
@@ -879,7 +1240,27 @@
                 <w:color w:val="1E1E1E"/>
                 <w:sz w:val="16"/>
               </w:rPr>
-              <w:t>Установка</w:t>
+              <w:t>Кто может работать в сервисе</w:t>
+            </w:r>
+          </w:p>
+        </w:tc>
+        <w:tc>
+          <w:tcPr>
+            <w:tcW w:type="dxa" w:w="3439"/>
+            <w:shd w:fill="F3F0FA" w:val="clear"/>
+          </w:tcPr>
+          <w:p>
+            <w:pPr>
+              <w:jc w:val="left"/>
+            </w:pPr>
+            <w:r>
+              <w:rPr>
+                <w:rFonts w:ascii="Arial" w:hAnsi="Arial" w:eastAsia="Arial"/>
+                <w:b w:val="0"/>
+                <w:color w:val="1E1E1E"/>
+                <w:sz w:val="16"/>
+              </w:rPr>
+              <w:t>Бухгалтер, логист, склад, руководитель, водитель — с разграничением прав</w:t>
             </w:r>
           </w:p>
         </w:tc>
@@ -899,27 +1280,7 @@
                 <w:color w:val="1E1E1E"/>
                 <w:sz w:val="16"/>
               </w:rPr>
-              <w:t>Типовой функционал, без расширений</w:t>
-            </w:r>
-          </w:p>
-        </w:tc>
-        <w:tc>
-          <w:tcPr>
-            <w:tcW w:type="dxa" w:w="3439"/>
-            <w:shd w:fill="F5F5F5" w:val="clear"/>
-          </w:tcPr>
-          <w:p>
-            <w:pPr>
-              <w:jc w:val="left"/>
-            </w:pPr>
-            <w:r>
-              <w:rPr>
-                <w:rFonts w:ascii="Arial" w:hAnsi="Arial" w:eastAsia="Arial"/>
-                <w:b w:val="0"/>
-                <w:color w:val="1E1E1E"/>
-                <w:sz w:val="16"/>
-              </w:rPr>
-              <w:t>Расширение в 1С (веб и мобильный — сразу)</w:t>
+              <w:t>Пользователи, у которых есть доступ к базе 1С</w:t>
             </w:r>
           </w:p>
         </w:tc>
@@ -941,7 +1302,7 @@
                 <w:color w:val="1E1E1E"/>
                 <w:sz w:val="16"/>
               </w:rPr>
-              <w:t>Типы документов</w:t>
+              <w:t>Какие документы доступны</w:t>
             </w:r>
           </w:p>
         </w:tc>
@@ -961,7 +1322,7 @@
                 <w:color w:val="1E1E1E"/>
                 <w:sz w:val="16"/>
               </w:rPr>
-              <w:t>Фокус на ЭПД (ЭТрН, ЭЗЗ, ЭПЛ и др.)</w:t>
+              <w:t>Перевозочные документы + полный электронный документооборот с контрагентами</w:t>
             </w:r>
           </w:p>
         </w:tc>
@@ -981,7 +1342,7 @@
                 <w:color w:val="1E1E1E"/>
                 <w:sz w:val="16"/>
               </w:rPr>
-              <w:t>ЭПД + полный ЭДО с контрагентами</w:t>
+              <w:t>Фокус на электронных перевозочных документах</w:t>
             </w:r>
           </w:p>
         </w:tc>
@@ -990,7 +1351,7 @@
         <w:tc>
           <w:tcPr>
             <w:tcW w:type="dxa" w:w="3439"/>
-            <w:shd w:fill="F5F5F5" w:val="clear"/>
+            <w:shd w:fill="F3F0FA" w:val="clear"/>
           </w:tcPr>
           <w:p>
             <w:pPr>
@@ -1003,7 +1364,27 @@
                 <w:color w:val="1E1E1E"/>
                 <w:sz w:val="16"/>
               </w:rPr>
-              <w:t>Хранение</w:t>
+              <w:t>Где хранятся документы</w:t>
+            </w:r>
+          </w:p>
+        </w:tc>
+        <w:tc>
+          <w:tcPr>
+            <w:tcW w:type="dxa" w:w="3439"/>
+            <w:shd w:fill="F3F0FA" w:val="clear"/>
+          </w:tcPr>
+          <w:p>
+            <w:pPr>
+              <w:jc w:val="left"/>
+            </w:pPr>
+            <w:r>
+              <w:rPr>
+                <w:rFonts w:ascii="Arial" w:hAnsi="Arial" w:eastAsia="Arial"/>
+                <w:b w:val="0"/>
+                <w:color w:val="1E1E1E"/>
+                <w:sz w:val="16"/>
+              </w:rPr>
+              <w:t>Надёжный облачный архив + синхронизация с 1С</w:t>
             </w:r>
           </w:p>
         </w:tc>
@@ -1027,6 +1408,110 @@
             </w:r>
           </w:p>
         </w:tc>
+      </w:tr>
+      <w:tr>
+        <w:tc>
+          <w:tcPr>
+            <w:tcW w:type="dxa" w:w="3439"/>
+            <w:shd w:fill="FFFFFF" w:val="clear"/>
+          </w:tcPr>
+          <w:p>
+            <w:pPr>
+              <w:jc w:val="left"/>
+            </w:pPr>
+            <w:r>
+              <w:rPr>
+                <w:rFonts w:ascii="Arial" w:hAnsi="Arial" w:eastAsia="Arial"/>
+                <w:b/>
+                <w:color w:val="1E1E1E"/>
+                <w:sz w:val="16"/>
+              </w:rPr>
+              <w:t>Подписание вне офиса</w:t>
+            </w:r>
+          </w:p>
+        </w:tc>
+        <w:tc>
+          <w:tcPr>
+            <w:tcW w:type="dxa" w:w="3439"/>
+            <w:shd w:fill="FFFFFF" w:val="clear"/>
+          </w:tcPr>
+          <w:p>
+            <w:pPr>
+              <w:jc w:val="left"/>
+            </w:pPr>
+            <w:r>
+              <w:rPr>
+                <w:rFonts w:ascii="Arial" w:hAnsi="Arial" w:eastAsia="Arial"/>
+                <w:b w:val="0"/>
+                <w:color w:val="1E1E1E"/>
+                <w:sz w:val="16"/>
+              </w:rPr>
+              <w:t>Удобно из браузера и с телефона без доступа к рабочему компьютеру</w:t>
+            </w:r>
+          </w:p>
+        </w:tc>
+        <w:tc>
+          <w:tcPr>
+            <w:tcW w:type="dxa" w:w="3439"/>
+            <w:shd w:fill="FFFFFF" w:val="clear"/>
+          </w:tcPr>
+          <w:p>
+            <w:pPr>
+              <w:jc w:val="left"/>
+            </w:pPr>
+            <w:r>
+              <w:rPr>
+                <w:rFonts w:ascii="Arial" w:hAnsi="Arial" w:eastAsia="Arial"/>
+                <w:b w:val="0"/>
+                <w:color w:val="1E1E1E"/>
+                <w:sz w:val="16"/>
+              </w:rPr>
+              <w:t>Возможно через мобильное приложение при настроенной связке с 1С</w:t>
+            </w:r>
+          </w:p>
+        </w:tc>
+      </w:tr>
+      <w:tr>
+        <w:tc>
+          <w:tcPr>
+            <w:tcW w:type="dxa" w:w="3439"/>
+            <w:shd w:fill="F3F0FA" w:val="clear"/>
+          </w:tcPr>
+          <w:p>
+            <w:pPr>
+              <w:jc w:val="left"/>
+            </w:pPr>
+            <w:r>
+              <w:rPr>
+                <w:rFonts w:ascii="Arial" w:hAnsi="Arial" w:eastAsia="Arial"/>
+                <w:b/>
+                <w:color w:val="1E1E1E"/>
+                <w:sz w:val="16"/>
+              </w:rPr>
+              <w:t>Сценарий «логист отдельно от бухгалтера»</w:t>
+            </w:r>
+          </w:p>
+        </w:tc>
+        <w:tc>
+          <w:tcPr>
+            <w:tcW w:type="dxa" w:w="3439"/>
+            <w:shd w:fill="F3F0FA" w:val="clear"/>
+          </w:tcPr>
+          <w:p>
+            <w:pPr>
+              <w:jc w:val="left"/>
+            </w:pPr>
+            <w:r>
+              <w:rPr>
+                <w:rFonts w:ascii="Arial" w:hAnsi="Arial" w:eastAsia="Arial"/>
+                <w:b w:val="0"/>
+                <w:color w:val="1E1E1E"/>
+                <w:sz w:val="16"/>
+              </w:rPr>
+              <w:t>Да: логист работает в сервисе, не заходя в основную базу 1С</w:t>
+            </w:r>
+          </w:p>
+        </w:tc>
         <w:tc>
           <w:tcPr>
             <w:tcW w:type="dxa" w:w="3439"/>
@@ -1043,7 +1528,7 @@
                 <w:color w:val="1E1E1E"/>
                 <w:sz w:val="16"/>
               </w:rPr>
-              <w:t>Облачный архив + синхронизация</w:t>
+              <w:t>Как правило, работа идёт через учётную систему 1С</w:t>
             </w:r>
           </w:p>
         </w:tc>
@@ -1065,7 +1550,7 @@
                 <w:color w:val="1E1E1E"/>
                 <w:sz w:val="16"/>
               </w:rPr>
-              <w:t>Старт для новичков</w:t>
+              <w:t>Старт для новых клиентов</w:t>
             </w:r>
           </w:p>
         </w:tc>
@@ -1085,7 +1570,7 @@
                 <w:color w:val="1E1E1E"/>
                 <w:sz w:val="16"/>
               </w:rPr>
-              <w:t>1С:Клиент ЭДО (бесплатно)</w:t>
+              <w:t>Промотариф: 3 месяца безлимитных отправок при покупке пакета</w:t>
             </w:r>
           </w:p>
         </w:tc>
@@ -1105,7 +1590,7 @@
                 <w:color w:val="1E1E1E"/>
                 <w:sz w:val="16"/>
               </w:rPr>
-              <w:t>Промотариф 3 мес. безлимит*</w:t>
+              <w:t>Акция: бесплатная настройка рабочего места при пакете от 1 000 документов</w:t>
             </w:r>
           </w:p>
         </w:tc>
@@ -1114,7 +1599,7 @@
         <w:tc>
           <w:tcPr>
             <w:tcW w:type="dxa" w:w="3439"/>
-            <w:shd w:fill="F5F5F5" w:val="clear"/>
+            <w:shd w:fill="F3F0FA" w:val="clear"/>
           </w:tcPr>
           <w:p>
             <w:pPr>
@@ -1127,7 +1612,27 @@
                 <w:color w:val="1E1E1E"/>
                 <w:sz w:val="16"/>
               </w:rPr>
-              <w:t>Модель оплаты</w:t>
+              <w:t>Ежедневное удобство</w:t>
+            </w:r>
+          </w:p>
+        </w:tc>
+        <w:tc>
+          <w:tcPr>
+            <w:tcW w:type="dxa" w:w="3439"/>
+            <w:shd w:fill="F3F0FA" w:val="clear"/>
+          </w:tcPr>
+          <w:p>
+            <w:pPr>
+              <w:jc w:val="left"/>
+            </w:pPr>
+            <w:r>
+              <w:rPr>
+                <w:rFonts w:ascii="Arial" w:hAnsi="Arial" w:eastAsia="Arial"/>
+                <w:b w:val="0"/>
+                <w:color w:val="1E1E1E"/>
+                <w:sz w:val="16"/>
+              </w:rPr>
+              <w:t>Одно окно для перевозок и обычного обмена документами</w:t>
             </w:r>
           </w:p>
         </w:tc>
@@ -1147,27 +1652,7 @@
                 <w:color w:val="1E1E1E"/>
                 <w:sz w:val="16"/>
               </w:rPr>
-              <w:t>Пакеты титулов / постоплата 7 ₽</w:t>
-            </w:r>
-          </w:p>
-        </w:tc>
-        <w:tc>
-          <w:tcPr>
-            <w:tcW w:type="dxa" w:w="3439"/>
-            <w:shd w:fill="F5F5F5" w:val="clear"/>
-          </w:tcPr>
-          <w:p>
-            <w:pPr>
-              <w:jc w:val="left"/>
-            </w:pPr>
-            <w:r>
-              <w:rPr>
-                <w:rFonts w:ascii="Arial" w:hAnsi="Arial" w:eastAsia="Arial"/>
-                <w:b w:val="0"/>
-                <w:color w:val="1E1E1E"/>
-                <w:sz w:val="16"/>
-              </w:rPr>
-              <w:t>Годовые пакеты исходящих документов</w:t>
+              <w:t>Отдельный контур для перевозочных документов в 1С</w:t>
             </w:r>
           </w:p>
         </w:tc>
@@ -1175,21 +1660,22 @@
     </w:tbl>
     <w:p>
       <w:pPr>
-        <w:spacing w:before="80" w:after="80"/>
+        <w:spacing w:after="120" w:before="120" w:line="288" w:lineRule="auto"/>
+        <w:jc w:val="left"/>
       </w:pPr>
       <w:r>
         <w:rPr>
           <w:rFonts w:ascii="Arial" w:hAnsi="Arial" w:eastAsia="Arial"/>
-          <w:b w:val="0"/>
-          <w:color w:val="555555"/>
-          <w:sz w:val="16"/>
+          <w:b/>
+          <w:color w:val="1E1E1E"/>
+          <w:sz w:val="18"/>
         </w:rPr>
-        <w:t>* Промотариф Доки недоступен клиентам с учётной записью в сервисе Астрал.ЭДО. Ключевое отличие: 1С-ЭПД — типовое решение внутри 1С; Доки.Логистика работает независимо в 1С, вебе и мобильном приложении.</w:t>
+        <w:t>Итог для большинства компаний: Доки.Логистика даёт больше свободы в организации работы и закрывает и перевозки, и обычный электронный документооборот. 1С-ЭПД оставляем как вариант для тех, кто хочет остаться строго внутри типовой 1С.</w:t>
       </w:r>
     </w:p>
     <w:p>
       <w:pPr>
-        <w:spacing w:before="280" w:after="120"/>
+        <w:spacing w:before="240" w:after="120"/>
         <w:pBdr>
           <w:bottom w:val="single" w:sz="18" w:space="4" w:color="E8B84A"/>
         </w:pBdr>
@@ -1199,37 +1685,24 @@
           <w:rFonts w:ascii="Arial" w:hAnsi="Arial" w:eastAsia="Arial"/>
           <w:b/>
           <w:color w:val="1E1E1E"/>
-          <w:sz w:val="28"/>
+          <w:sz w:val="26"/>
         </w:rPr>
-        <w:t>Стоимость пакетов документов</w:t>
+        <w:t>Стоимость пакетов документов Доки.Логистика</w:t>
       </w:r>
     </w:p>
     <w:p>
       <w:pPr>
-        <w:spacing w:before="40" w:after="80"/>
-      </w:pPr>
-      <w:r>
-        <w:rPr>
-          <w:rFonts w:ascii="Arial" w:hAnsi="Arial" w:eastAsia="Arial"/>
-          <w:b/>
-          <w:color w:val="1E1E1E"/>
-          <w:sz w:val="22"/>
-        </w:rPr>
-        <w:t>1С-ЭПД — предоплатные пакеты титулов (12 месяцев)</w:t>
-      </w:r>
-    </w:p>
-    <w:p>
-      <w:pPr>
-        <w:spacing w:after="80"/>
+        <w:spacing w:after="80" w:before="0" w:line="288" w:lineRule="auto"/>
+        <w:jc w:val="left"/>
       </w:pPr>
       <w:r>
         <w:rPr>
           <w:rFonts w:ascii="Arial" w:hAnsi="Arial" w:eastAsia="Arial"/>
           <w:b w:val="0"/>
-          <w:color w:val="555555"/>
-          <w:sz w:val="16"/>
+          <w:color w:val="1E1E1E"/>
+          <w:sz w:val="18"/>
         </w:rPr>
-        <w:t>Постоплатная модель: 7 ₽ за 1 титул. Титулы в ЭЗЗ бесплатны для ГО и перевозчика; в ЭТрН оплачиваются Т1 (ГО) и Т2 (перевозчик); в ЭПЛ — Т4. Актуально до 31.12.2026.</w:t>
+        <w:t>Вы оплачиваете годовой пакет исходящих документов. Входящие документы от контрагентов можно получать и подписывать без покупки тарифа. Чем больше пакет — тем ниже цена одной отправки. Срок действия тарифа — 12 месяцев. Неизрасходованный остаток переносится на следующий период, если новый пакет куплен вовремя и стоит в очереди на активацию.</w:t>
       </w:r>
     </w:p>
     <w:tbl>
@@ -1267,7 +1740,7 @@
                 <w:color w:val="FFFFFF"/>
                 <w:sz w:val="18"/>
               </w:rPr>
-              <w:t>Пакет</w:t>
+              <w:t>Количество документов в год</w:t>
             </w:r>
           </w:p>
         </w:tc>
@@ -1287,7 +1760,7 @@
                 <w:color w:val="FFFFFF"/>
                 <w:sz w:val="18"/>
               </w:rPr>
-              <w:t>Цена за 1 документ, ₽</w:t>
+              <w:t>Цена за 1 документ, руб.</w:t>
             </w:r>
           </w:p>
         </w:tc>
@@ -1307,7 +1780,7 @@
                 <w:color w:val="FFFFFF"/>
                 <w:sz w:val="18"/>
               </w:rPr>
-              <w:t>Стоимость пакета, ₽</w:t>
+              <w:t>Стоимость тарифа, руб. / год</w:t>
             </w:r>
           </w:p>
         </w:tc>
@@ -1316,511 +1789,7 @@
         <w:tc>
           <w:tcPr>
             <w:tcW w:type="dxa" w:w="3439"/>
-            <w:shd w:fill="FFF8E7" w:val="clear"/>
-          </w:tcPr>
-          <w:p>
-            <w:pPr>
-              <w:jc w:val="left"/>
-            </w:pPr>
-            <w:r>
-              <w:rPr>
-                <w:rFonts w:ascii="Arial" w:hAnsi="Arial" w:eastAsia="Arial"/>
-                <w:b/>
-                <w:color w:val="1E1E1E"/>
-                <w:sz w:val="18"/>
-              </w:rPr>
-              <w:t>«1С-ЭДО. ЭПД-600»</w:t>
-            </w:r>
-          </w:p>
-        </w:tc>
-        <w:tc>
-          <w:tcPr>
-            <w:tcW w:type="dxa" w:w="3439"/>
-            <w:shd w:fill="FFF8E7" w:val="clear"/>
-          </w:tcPr>
-          <w:p>
-            <w:pPr>
-              <w:jc w:val="center"/>
-            </w:pPr>
-            <w:r>
-              <w:rPr>
-                <w:rFonts w:ascii="Arial" w:hAnsi="Arial" w:eastAsia="Arial"/>
-                <w:b w:val="0"/>
-                <w:color w:val="1E1E1E"/>
-                <w:sz w:val="18"/>
-              </w:rPr>
-              <w:t>6,00</w:t>
-            </w:r>
-          </w:p>
-        </w:tc>
-        <w:tc>
-          <w:tcPr>
-            <w:tcW w:type="dxa" w:w="3439"/>
-            <w:shd w:fill="FFF8E7" w:val="clear"/>
-          </w:tcPr>
-          <w:p>
-            <w:pPr>
-              <w:jc w:val="center"/>
-            </w:pPr>
-            <w:r>
-              <w:rPr>
-                <w:rFonts w:ascii="Arial" w:hAnsi="Arial" w:eastAsia="Arial"/>
-                <w:b/>
-                <w:color w:val="1E1E1E"/>
-                <w:sz w:val="18"/>
-              </w:rPr>
-              <w:t>3 600</w:t>
-            </w:r>
-          </w:p>
-        </w:tc>
-      </w:tr>
-      <w:tr>
-        <w:tc>
-          <w:tcPr>
-            <w:tcW w:type="dxa" w:w="3439"/>
-            <w:shd w:fill="FFFFFF" w:val="clear"/>
-          </w:tcPr>
-          <w:p>
-            <w:pPr>
-              <w:jc w:val="left"/>
-            </w:pPr>
-            <w:r>
-              <w:rPr>
-                <w:rFonts w:ascii="Arial" w:hAnsi="Arial" w:eastAsia="Arial"/>
-                <w:b/>
-                <w:color w:val="1E1E1E"/>
-                <w:sz w:val="18"/>
-              </w:rPr>
-              <w:t>«1С-ЭДО. ЭПД-1000»</w:t>
-            </w:r>
-          </w:p>
-        </w:tc>
-        <w:tc>
-          <w:tcPr>
-            <w:tcW w:type="dxa" w:w="3439"/>
-            <w:shd w:fill="FFFFFF" w:val="clear"/>
-          </w:tcPr>
-          <w:p>
-            <w:pPr>
-              <w:jc w:val="center"/>
-            </w:pPr>
-            <w:r>
-              <w:rPr>
-                <w:rFonts w:ascii="Arial" w:hAnsi="Arial" w:eastAsia="Arial"/>
-                <w:b w:val="0"/>
-                <w:color w:val="1E1E1E"/>
-                <w:sz w:val="18"/>
-              </w:rPr>
-              <w:t>5,00</w:t>
-            </w:r>
-          </w:p>
-        </w:tc>
-        <w:tc>
-          <w:tcPr>
-            <w:tcW w:type="dxa" w:w="3439"/>
-            <w:shd w:fill="FFFFFF" w:val="clear"/>
-          </w:tcPr>
-          <w:p>
-            <w:pPr>
-              <w:jc w:val="center"/>
-            </w:pPr>
-            <w:r>
-              <w:rPr>
-                <w:rFonts w:ascii="Arial" w:hAnsi="Arial" w:eastAsia="Arial"/>
-                <w:b/>
-                <w:color w:val="1E1E1E"/>
-                <w:sz w:val="18"/>
-              </w:rPr>
-              <w:t>5 000</w:t>
-            </w:r>
-          </w:p>
-        </w:tc>
-      </w:tr>
-      <w:tr>
-        <w:tc>
-          <w:tcPr>
-            <w:tcW w:type="dxa" w:w="3439"/>
-            <w:shd w:fill="FFF8E7" w:val="clear"/>
-          </w:tcPr>
-          <w:p>
-            <w:pPr>
-              <w:jc w:val="left"/>
-            </w:pPr>
-            <w:r>
-              <w:rPr>
-                <w:rFonts w:ascii="Arial" w:hAnsi="Arial" w:eastAsia="Arial"/>
-                <w:b/>
-                <w:color w:val="1E1E1E"/>
-                <w:sz w:val="18"/>
-              </w:rPr>
-              <w:t>«1С-ЭДО. ЭПД-5000»</w:t>
-            </w:r>
-          </w:p>
-        </w:tc>
-        <w:tc>
-          <w:tcPr>
-            <w:tcW w:type="dxa" w:w="3439"/>
-            <w:shd w:fill="FFF8E7" w:val="clear"/>
-          </w:tcPr>
-          <w:p>
-            <w:pPr>
-              <w:jc w:val="center"/>
-            </w:pPr>
-            <w:r>
-              <w:rPr>
-                <w:rFonts w:ascii="Arial" w:hAnsi="Arial" w:eastAsia="Arial"/>
-                <w:b w:val="0"/>
-                <w:color w:val="1E1E1E"/>
-                <w:sz w:val="18"/>
-              </w:rPr>
-              <w:t>4,50</w:t>
-            </w:r>
-          </w:p>
-        </w:tc>
-        <w:tc>
-          <w:tcPr>
-            <w:tcW w:type="dxa" w:w="3439"/>
-            <w:shd w:fill="FFF8E7" w:val="clear"/>
-          </w:tcPr>
-          <w:p>
-            <w:pPr>
-              <w:jc w:val="center"/>
-            </w:pPr>
-            <w:r>
-              <w:rPr>
-                <w:rFonts w:ascii="Arial" w:hAnsi="Arial" w:eastAsia="Arial"/>
-                <w:b/>
-                <w:color w:val="1E1E1E"/>
-                <w:sz w:val="18"/>
-              </w:rPr>
-              <w:t>22 500</w:t>
-            </w:r>
-          </w:p>
-        </w:tc>
-      </w:tr>
-      <w:tr>
-        <w:tc>
-          <w:tcPr>
-            <w:tcW w:type="dxa" w:w="3439"/>
-            <w:shd w:fill="FFFFFF" w:val="clear"/>
-          </w:tcPr>
-          <w:p>
-            <w:pPr>
-              <w:jc w:val="left"/>
-            </w:pPr>
-            <w:r>
-              <w:rPr>
-                <w:rFonts w:ascii="Arial" w:hAnsi="Arial" w:eastAsia="Arial"/>
-                <w:b/>
-                <w:color w:val="1E1E1E"/>
-                <w:sz w:val="18"/>
-              </w:rPr>
-              <w:t>«1С-ЭДО. ЭПД-10000»</w:t>
-            </w:r>
-          </w:p>
-        </w:tc>
-        <w:tc>
-          <w:tcPr>
-            <w:tcW w:type="dxa" w:w="3439"/>
-            <w:shd w:fill="FFFFFF" w:val="clear"/>
-          </w:tcPr>
-          <w:p>
-            <w:pPr>
-              <w:jc w:val="center"/>
-            </w:pPr>
-            <w:r>
-              <w:rPr>
-                <w:rFonts w:ascii="Arial" w:hAnsi="Arial" w:eastAsia="Arial"/>
-                <w:b w:val="0"/>
-                <w:color w:val="1E1E1E"/>
-                <w:sz w:val="18"/>
-              </w:rPr>
-              <w:t>4,00</w:t>
-            </w:r>
-          </w:p>
-        </w:tc>
-        <w:tc>
-          <w:tcPr>
-            <w:tcW w:type="dxa" w:w="3439"/>
-            <w:shd w:fill="FFFFFF" w:val="clear"/>
-          </w:tcPr>
-          <w:p>
-            <w:pPr>
-              <w:jc w:val="center"/>
-            </w:pPr>
-            <w:r>
-              <w:rPr>
-                <w:rFonts w:ascii="Arial" w:hAnsi="Arial" w:eastAsia="Arial"/>
-                <w:b/>
-                <w:color w:val="1E1E1E"/>
-                <w:sz w:val="18"/>
-              </w:rPr>
-              <w:t>40 000</w:t>
-            </w:r>
-          </w:p>
-        </w:tc>
-      </w:tr>
-      <w:tr>
-        <w:tc>
-          <w:tcPr>
-            <w:tcW w:type="dxa" w:w="3439"/>
-            <w:shd w:fill="FFF8E7" w:val="clear"/>
-          </w:tcPr>
-          <w:p>
-            <w:pPr>
-              <w:jc w:val="left"/>
-            </w:pPr>
-            <w:r>
-              <w:rPr>
-                <w:rFonts w:ascii="Arial" w:hAnsi="Arial" w:eastAsia="Arial"/>
-                <w:b/>
-                <w:color w:val="1E1E1E"/>
-                <w:sz w:val="18"/>
-              </w:rPr>
-              <w:t>«1С-ЭДО. ЭПД-50000»</w:t>
-            </w:r>
-          </w:p>
-        </w:tc>
-        <w:tc>
-          <w:tcPr>
-            <w:tcW w:type="dxa" w:w="3439"/>
-            <w:shd w:fill="FFF8E7" w:val="clear"/>
-          </w:tcPr>
-          <w:p>
-            <w:pPr>
-              <w:jc w:val="center"/>
-            </w:pPr>
-            <w:r>
-              <w:rPr>
-                <w:rFonts w:ascii="Arial" w:hAnsi="Arial" w:eastAsia="Arial"/>
-                <w:b w:val="0"/>
-                <w:color w:val="1E1E1E"/>
-                <w:sz w:val="18"/>
-              </w:rPr>
-              <w:t>3,00</w:t>
-            </w:r>
-          </w:p>
-        </w:tc>
-        <w:tc>
-          <w:tcPr>
-            <w:tcW w:type="dxa" w:w="3439"/>
-            <w:shd w:fill="FFF8E7" w:val="clear"/>
-          </w:tcPr>
-          <w:p>
-            <w:pPr>
-              <w:jc w:val="center"/>
-            </w:pPr>
-            <w:r>
-              <w:rPr>
-                <w:rFonts w:ascii="Arial" w:hAnsi="Arial" w:eastAsia="Arial"/>
-                <w:b/>
-                <w:color w:val="1E1E1E"/>
-                <w:sz w:val="18"/>
-              </w:rPr>
-              <w:t>150 000</w:t>
-            </w:r>
-          </w:p>
-        </w:tc>
-      </w:tr>
-      <w:tr>
-        <w:tc>
-          <w:tcPr>
-            <w:tcW w:type="dxa" w:w="3439"/>
-            <w:shd w:fill="FFFFFF" w:val="clear"/>
-          </w:tcPr>
-          <w:p>
-            <w:pPr>
-              <w:jc w:val="left"/>
-            </w:pPr>
-            <w:r>
-              <w:rPr>
-                <w:rFonts w:ascii="Arial" w:hAnsi="Arial" w:eastAsia="Arial"/>
-                <w:b/>
-                <w:color w:val="1E1E1E"/>
-                <w:sz w:val="18"/>
-              </w:rPr>
-              <w:t>«1С-ЭДО. ЭПД-100000»</w:t>
-            </w:r>
-          </w:p>
-        </w:tc>
-        <w:tc>
-          <w:tcPr>
-            <w:tcW w:type="dxa" w:w="3439"/>
-            <w:shd w:fill="FFFFFF" w:val="clear"/>
-          </w:tcPr>
-          <w:p>
-            <w:pPr>
-              <w:jc w:val="center"/>
-            </w:pPr>
-            <w:r>
-              <w:rPr>
-                <w:rFonts w:ascii="Arial" w:hAnsi="Arial" w:eastAsia="Arial"/>
-                <w:b w:val="0"/>
-                <w:color w:val="1E1E1E"/>
-                <w:sz w:val="18"/>
-              </w:rPr>
-              <w:t>2,50</w:t>
-            </w:r>
-          </w:p>
-        </w:tc>
-        <w:tc>
-          <w:tcPr>
-            <w:tcW w:type="dxa" w:w="3439"/>
-            <w:shd w:fill="FFFFFF" w:val="clear"/>
-          </w:tcPr>
-          <w:p>
-            <w:pPr>
-              <w:jc w:val="center"/>
-            </w:pPr>
-            <w:r>
-              <w:rPr>
-                <w:rFonts w:ascii="Arial" w:hAnsi="Arial" w:eastAsia="Arial"/>
-                <w:b/>
-                <w:color w:val="1E1E1E"/>
-                <w:sz w:val="18"/>
-              </w:rPr>
-              <w:t>250 000</w:t>
-            </w:r>
-          </w:p>
-        </w:tc>
-      </w:tr>
-    </w:tbl>
-    <w:p>
-      <w:pPr>
-        <w:spacing w:before="120" w:after="160"/>
-      </w:pPr>
-      <w:r>
-        <w:rPr>
-          <w:rFonts w:ascii="Arial" w:hAnsi="Arial" w:eastAsia="Arial"/>
-          <w:b/>
-          <w:color w:val="1E1E1E"/>
-          <w:sz w:val="18"/>
-        </w:rPr>
-        <w:t xml:space="preserve">Акция: </w:t>
-      </w:r>
-      <w:r>
-        <w:rPr>
-          <w:rFonts w:ascii="Arial" w:hAnsi="Arial" w:eastAsia="Arial"/>
-          <w:b w:val="0"/>
-          <w:color w:val="1E1E1E"/>
-          <w:sz w:val="18"/>
-        </w:rPr>
-        <w:t>при покупке пакета от 1 000 титулов — бесплатная настройка 1 рабочего места для работы с ЭПД (активация сервиса, КриптоПро, УКЭП, МЧД, до 3 контрагентов). Лицензия СКЗИ и сертификаты 1С:Подпись оплачиваются отдельно.</w:t>
-      </w:r>
-    </w:p>
-    <w:p>
-      <w:pPr>
-        <w:spacing w:before="80" w:after="80"/>
-      </w:pPr>
-      <w:r>
-        <w:rPr>
-          <w:rFonts w:ascii="Arial" w:hAnsi="Arial" w:eastAsia="Arial"/>
-          <w:b/>
-          <w:color w:val="1E1E1E"/>
-          <w:sz w:val="22"/>
-        </w:rPr>
-        <w:t>Доки.Логистика — тарифы на исходящие документы (12 месяцев)</w:t>
-      </w:r>
-    </w:p>
-    <w:p>
-      <w:pPr>
-        <w:spacing w:after="80"/>
-      </w:pPr>
-      <w:r>
-        <w:rPr>
-          <w:rFonts w:ascii="Arial" w:hAnsi="Arial" w:eastAsia="Arial"/>
-          <w:b w:val="0"/>
-          <w:color w:val="555555"/>
-          <w:sz w:val="16"/>
-        </w:rPr>
-        <w:t>Входящие документы подписываются без тарифа. Чем больше пакет — тем ниже цена одного документа. Неизрасходованный остаток переносится при своевременном продлении. Для сравнения: стоимость бумажного документа ≈ 50 ₽.</w:t>
-      </w:r>
-    </w:p>
-    <w:tbl>
-      <w:tblPr>
-        <w:tblW w:type="auto" w:w="0"/>
-        <w:tblLook w:firstColumn="1" w:firstRow="1" w:lastColumn="0" w:lastRow="0" w:noHBand="0" w:noVBand="1" w:val="04A0"/>
-        <w:tblBorders>
-          <w:top w:val="single" w:sz="4" w:space="0" w:color="DDDDDD"/>
-          <w:left w:val="single" w:sz="4" w:space="0" w:color="DDDDDD"/>
-          <w:bottom w:val="single" w:sz="4" w:space="0" w:color="DDDDDD"/>
-          <w:right w:val="single" w:sz="4" w:space="0" w:color="DDDDDD"/>
-          <w:insideH w:val="single" w:sz="4" w:space="0" w:color="DDDDDD"/>
-          <w:insideV w:val="single" w:sz="4" w:space="0" w:color="DDDDDD"/>
-        </w:tblBorders>
-      </w:tblPr>
-      <w:tblGrid>
-        <w:gridCol w:w="3439"/>
-        <w:gridCol w:w="3439"/>
-        <w:gridCol w:w="3439"/>
-      </w:tblGrid>
-      <w:tr>
-        <w:tc>
-          <w:tcPr>
-            <w:tcW w:type="dxa" w:w="3439"/>
-            <w:shd w:fill="1E1E1E" w:val="clear"/>
-          </w:tcPr>
-          <w:p>
-            <w:pPr>
-              <w:jc w:val="left"/>
-            </w:pPr>
-            <w:r>
-              <w:rPr>
-                <w:rFonts w:ascii="Arial" w:hAnsi="Arial" w:eastAsia="Arial"/>
-                <w:b/>
-                <w:color w:val="FFFFFF"/>
-                <w:sz w:val="18"/>
-              </w:rPr>
-              <w:t>Кол-во документов / год</w:t>
-            </w:r>
-          </w:p>
-        </w:tc>
-        <w:tc>
-          <w:tcPr>
-            <w:tcW w:type="dxa" w:w="3439"/>
-            <w:shd w:fill="1E1E1E" w:val="clear"/>
-          </w:tcPr>
-          <w:p>
-            <w:pPr>
-              <w:jc w:val="center"/>
-            </w:pPr>
-            <w:r>
-              <w:rPr>
-                <w:rFonts w:ascii="Arial" w:hAnsi="Arial" w:eastAsia="Arial"/>
-                <w:b/>
-                <w:color w:val="FFFFFF"/>
-                <w:sz w:val="18"/>
-              </w:rPr>
-              <w:t>Стоимость 1 док-та, ₽</w:t>
-            </w:r>
-          </w:p>
-        </w:tc>
-        <w:tc>
-          <w:tcPr>
-            <w:tcW w:type="dxa" w:w="3439"/>
-            <w:shd w:fill="1E1E1E" w:val="clear"/>
-          </w:tcPr>
-          <w:p>
-            <w:pPr>
-              <w:jc w:val="center"/>
-            </w:pPr>
-            <w:r>
-              <w:rPr>
-                <w:rFonts w:ascii="Arial" w:hAnsi="Arial" w:eastAsia="Arial"/>
-                <w:b/>
-                <w:color w:val="FFFFFF"/>
-                <w:sz w:val="18"/>
-              </w:rPr>
-              <w:t>Стоимость тарифа, ₽ / год</w:t>
-            </w:r>
-          </w:p>
-        </w:tc>
-      </w:tr>
-      <w:tr>
-        <w:tc>
-          <w:tcPr>
-            <w:tcW w:type="dxa" w:w="3439"/>
-            <w:shd w:fill="F0EEF8" w:val="clear"/>
+            <w:shd w:fill="F3F0FA" w:val="clear"/>
           </w:tcPr>
           <w:p>
             <w:pPr>
@@ -1840,7 +1809,7 @@
         <w:tc>
           <w:tcPr>
             <w:tcW w:type="dxa" w:w="3439"/>
-            <w:shd w:fill="F0EEF8" w:val="clear"/>
+            <w:shd w:fill="F3F0FA" w:val="clear"/>
           </w:tcPr>
           <w:p>
             <w:pPr>
@@ -1860,7 +1829,7 @@
         <w:tc>
           <w:tcPr>
             <w:tcW w:type="dxa" w:w="3439"/>
-            <w:shd w:fill="F0EEF8" w:val="clear"/>
+            <w:shd w:fill="F3F0FA" w:val="clear"/>
           </w:tcPr>
           <w:p>
             <w:pPr>
@@ -1944,7 +1913,7 @@
         <w:tc>
           <w:tcPr>
             <w:tcW w:type="dxa" w:w="3439"/>
-            <w:shd w:fill="F0EEF8" w:val="clear"/>
+            <w:shd w:fill="F3F0FA" w:val="clear"/>
           </w:tcPr>
           <w:p>
             <w:pPr>
@@ -1964,7 +1933,7 @@
         <w:tc>
           <w:tcPr>
             <w:tcW w:type="dxa" w:w="3439"/>
-            <w:shd w:fill="F0EEF8" w:val="clear"/>
+            <w:shd w:fill="F3F0FA" w:val="clear"/>
           </w:tcPr>
           <w:p>
             <w:pPr>
@@ -1984,7 +1953,7 @@
         <w:tc>
           <w:tcPr>
             <w:tcW w:type="dxa" w:w="3439"/>
-            <w:shd w:fill="F0EEF8" w:val="clear"/>
+            <w:shd w:fill="F3F0FA" w:val="clear"/>
           </w:tcPr>
           <w:p>
             <w:pPr>
@@ -2068,7 +2037,7 @@
         <w:tc>
           <w:tcPr>
             <w:tcW w:type="dxa" w:w="3439"/>
-            <w:shd w:fill="F0EEF8" w:val="clear"/>
+            <w:shd w:fill="F3F0FA" w:val="clear"/>
           </w:tcPr>
           <w:p>
             <w:pPr>
@@ -2088,7 +2057,7 @@
         <w:tc>
           <w:tcPr>
             <w:tcW w:type="dxa" w:w="3439"/>
-            <w:shd w:fill="F0EEF8" w:val="clear"/>
+            <w:shd w:fill="F3F0FA" w:val="clear"/>
           </w:tcPr>
           <w:p>
             <w:pPr>
@@ -2108,7 +2077,7 @@
         <w:tc>
           <w:tcPr>
             <w:tcW w:type="dxa" w:w="3439"/>
-            <w:shd w:fill="F0EEF8" w:val="clear"/>
+            <w:shd w:fill="F3F0FA" w:val="clear"/>
           </w:tcPr>
           <w:p>
             <w:pPr>
@@ -2192,7 +2161,7 @@
         <w:tc>
           <w:tcPr>
             <w:tcW w:type="dxa" w:w="3439"/>
-            <w:shd w:fill="F0EEF8" w:val="clear"/>
+            <w:shd w:fill="F3F0FA" w:val="clear"/>
           </w:tcPr>
           <w:p>
             <w:pPr>
@@ -2212,7 +2181,7 @@
         <w:tc>
           <w:tcPr>
             <w:tcW w:type="dxa" w:w="3439"/>
-            <w:shd w:fill="F0EEF8" w:val="clear"/>
+            <w:shd w:fill="F3F0FA" w:val="clear"/>
           </w:tcPr>
           <w:p>
             <w:pPr>
@@ -2232,7 +2201,7 @@
         <w:tc>
           <w:tcPr>
             <w:tcW w:type="dxa" w:w="3439"/>
-            <w:shd w:fill="F0EEF8" w:val="clear"/>
+            <w:shd w:fill="F3F0FA" w:val="clear"/>
           </w:tcPr>
           <w:p>
             <w:pPr>
@@ -2316,7 +2285,7 @@
         <w:tc>
           <w:tcPr>
             <w:tcW w:type="dxa" w:w="3439"/>
-            <w:shd w:fill="F0EEF8" w:val="clear"/>
+            <w:shd w:fill="F3F0FA" w:val="clear"/>
           </w:tcPr>
           <w:p>
             <w:pPr>
@@ -2336,7 +2305,7 @@
         <w:tc>
           <w:tcPr>
             <w:tcW w:type="dxa" w:w="3439"/>
-            <w:shd w:fill="F0EEF8" w:val="clear"/>
+            <w:shd w:fill="F3F0FA" w:val="clear"/>
           </w:tcPr>
           <w:p>
             <w:pPr>
@@ -2356,7 +2325,7 @@
         <w:tc>
           <w:tcPr>
             <w:tcW w:type="dxa" w:w="3439"/>
-            <w:shd w:fill="F0EEF8" w:val="clear"/>
+            <w:shd w:fill="F3F0FA" w:val="clear"/>
           </w:tcPr>
           <w:p>
             <w:pPr>
@@ -2440,7 +2409,7 @@
         <w:tc>
           <w:tcPr>
             <w:tcW w:type="dxa" w:w="3439"/>
-            <w:shd w:fill="F0EEF8" w:val="clear"/>
+            <w:shd w:fill="F3F0FA" w:val="clear"/>
           </w:tcPr>
           <w:p>
             <w:pPr>
@@ -2460,7 +2429,7 @@
         <w:tc>
           <w:tcPr>
             <w:tcW w:type="dxa" w:w="3439"/>
-            <w:shd w:fill="F0EEF8" w:val="clear"/>
+            <w:shd w:fill="F3F0FA" w:val="clear"/>
           </w:tcPr>
           <w:p>
             <w:pPr>
@@ -2480,7 +2449,7 @@
         <w:tc>
           <w:tcPr>
             <w:tcW w:type="dxa" w:w="3439"/>
-            <w:shd w:fill="F0EEF8" w:val="clear"/>
+            <w:shd w:fill="F3F0FA" w:val="clear"/>
           </w:tcPr>
           <w:p>
             <w:pPr>
@@ -2499,32 +2468,59 @@
         </w:tc>
       </w:tr>
     </w:tbl>
+    <w:tbl>
+      <w:tblPr>
+        <w:tblW w:type="auto" w:w="0"/>
+        <w:tblLook w:firstColumn="1" w:firstRow="1" w:lastColumn="0" w:lastRow="0" w:noHBand="0" w:noVBand="1" w:val="04A0"/>
+        <w:tblBorders>
+          <w:top w:val="single" w:sz="10" w:space="0" w:color="E8B84A"/>
+          <w:left w:val="single" w:sz="10" w:space="0" w:color="E8B84A"/>
+          <w:bottom w:val="single" w:sz="10" w:space="0" w:color="E8B84A"/>
+          <w:right w:val="single" w:sz="10" w:space="0" w:color="E8B84A"/>
+          <w:insideH w:val="single" w:sz="10" w:space="0" w:color="E8B84A"/>
+          <w:insideV w:val="single" w:sz="10" w:space="0" w:color="E8B84A"/>
+        </w:tblBorders>
+      </w:tblPr>
+      <w:tblGrid>
+        <w:gridCol w:w="10318"/>
+      </w:tblGrid>
+      <w:tr>
+        <w:tc>
+          <w:tcPr>
+            <w:tcW w:type="dxa" w:w="10318"/>
+            <w:shd w:fill="FFF8E7" w:val="clear"/>
+          </w:tcPr>
+          <w:p>
+            <w:r>
+              <w:rPr>
+                <w:rFonts w:ascii="Arial" w:hAnsi="Arial" w:eastAsia="Arial"/>
+                <w:b/>
+                <w:color w:val="1E1E1E"/>
+                <w:sz w:val="20"/>
+              </w:rPr>
+              <w:t>Акция «15 месяцев по цене 12»</w:t>
+            </w:r>
+          </w:p>
+          <w:p>
+            <w:pPr>
+              <w:spacing w:before="40"/>
+            </w:pPr>
+            <w:r>
+              <w:rPr>
+                <w:rFonts w:ascii="Arial" w:hAnsi="Arial" w:eastAsia="Arial"/>
+                <w:b w:val="0"/>
+                <w:color w:val="1E1E1E"/>
+                <w:sz w:val="18"/>
+              </w:rPr>
+              <w:t>При покупке любого пакета Доки и 1 часа линии консультаций за 3 660 рублей мы даём дополнительно 3 месяца демо-доступа. Сначала вы пользуетесь демо-периодом, затем автоматически активируется оплаченный пакет. Итого — 15 месяцев работы вместо 12. Промотариф на 3 месяца безлимита доступен новым клиентам (не применяется, если уже есть учётная запись в сервисе Астрал.ЭДО).</w:t>
+            </w:r>
+          </w:p>
+        </w:tc>
+      </w:tr>
+    </w:tbl>
     <w:p>
       <w:pPr>
-        <w:spacing w:before="120" w:after="120"/>
-      </w:pPr>
-      <w:r>
-        <w:rPr>
-          <w:rFonts w:ascii="Arial" w:hAnsi="Arial" w:eastAsia="Arial"/>
-          <w:b/>
-          <w:color w:val="1E1E1E"/>
-          <w:sz w:val="18"/>
-        </w:rPr>
-        <w:t xml:space="preserve">Акция «15 месяцев по цене 12»: </w:t>
-      </w:r>
-      <w:r>
-        <w:rPr>
-          <w:rFonts w:ascii="Arial" w:hAnsi="Arial" w:eastAsia="Arial"/>
-          <w:b w:val="0"/>
-          <w:color w:val="1E1E1E"/>
-          <w:sz w:val="18"/>
-        </w:rPr>
-        <w:t>при покупке любого пакета Доки + 1 часа линии консультаций (3 660 ₽) — дополнительно 3 месяца демо-доступа. Оплаченный пакет активируется после демо-периода.</w:t>
-      </w:r>
-    </w:p>
-    <w:p>
-      <w:pPr>
-        <w:spacing w:before="280" w:after="120"/>
+        <w:spacing w:before="240" w:after="120"/>
         <w:pBdr>
           <w:bottom w:val="single" w:sz="18" w:space="4" w:color="E8B84A"/>
         </w:pBdr>
@@ -2534,7 +2530,507 @@
           <w:rFonts w:ascii="Arial" w:hAnsi="Arial" w:eastAsia="Arial"/>
           <w:b/>
           <w:color w:val="1E1E1E"/>
-          <w:sz w:val="28"/>
+          <w:sz w:val="26"/>
+        </w:rPr>
+        <w:t>Стоимость пакетов документов 1С-ЭПД</w:t>
+      </w:r>
+    </w:p>
+    <w:p>
+      <w:pPr>
+        <w:spacing w:after="80" w:before="0" w:line="288" w:lineRule="auto"/>
+        <w:jc w:val="left"/>
+      </w:pPr>
+      <w:r>
+        <w:rPr>
+          <w:rFonts w:ascii="Arial" w:hAnsi="Arial" w:eastAsia="Arial"/>
+          <w:b w:val="0"/>
+          <w:color w:val="1E1E1E"/>
+          <w:sz w:val="18"/>
+        </w:rPr>
+        <w:t>Для 1С-ЭПД доступны предоплатные пакеты на 12 месяцев и постоплатная модель (7 рублей за один отправленный титул документа). Важные правила оплаты титулов: в электронном заказе-заявке титулы бесплатны для грузоотправителя и перевозчика; в электронной транспортной накладной оплачиваются титул грузоотправителя и титул перевозчика; в электронном путевом листе оплачивается один титул. Правила актуальны до 31.12.2026.</w:t>
+      </w:r>
+    </w:p>
+    <w:tbl>
+      <w:tblPr>
+        <w:tblW w:type="auto" w:w="0"/>
+        <w:tblLook w:firstColumn="1" w:firstRow="1" w:lastColumn="0" w:lastRow="0" w:noHBand="0" w:noVBand="1" w:val="04A0"/>
+        <w:tblBorders>
+          <w:top w:val="single" w:sz="4" w:space="0" w:color="DDDDDD"/>
+          <w:left w:val="single" w:sz="4" w:space="0" w:color="DDDDDD"/>
+          <w:bottom w:val="single" w:sz="4" w:space="0" w:color="DDDDDD"/>
+          <w:right w:val="single" w:sz="4" w:space="0" w:color="DDDDDD"/>
+          <w:insideH w:val="single" w:sz="4" w:space="0" w:color="DDDDDD"/>
+          <w:insideV w:val="single" w:sz="4" w:space="0" w:color="DDDDDD"/>
+        </w:tblBorders>
+      </w:tblPr>
+      <w:tblGrid>
+        <w:gridCol w:w="3439"/>
+        <w:gridCol w:w="3439"/>
+        <w:gridCol w:w="3439"/>
+      </w:tblGrid>
+      <w:tr>
+        <w:tc>
+          <w:tcPr>
+            <w:tcW w:type="dxa" w:w="3439"/>
+            <w:shd w:fill="1E1E1E" w:val="clear"/>
+          </w:tcPr>
+          <w:p>
+            <w:pPr>
+              <w:jc w:val="left"/>
+            </w:pPr>
+            <w:r>
+              <w:rPr>
+                <w:rFonts w:ascii="Arial" w:hAnsi="Arial" w:eastAsia="Arial"/>
+                <w:b/>
+                <w:color w:val="FFFFFF"/>
+                <w:sz w:val="18"/>
+              </w:rPr>
+              <w:t>Пакет на 12 месяцев</w:t>
+            </w:r>
+          </w:p>
+        </w:tc>
+        <w:tc>
+          <w:tcPr>
+            <w:tcW w:type="dxa" w:w="3439"/>
+            <w:shd w:fill="1E1E1E" w:val="clear"/>
+          </w:tcPr>
+          <w:p>
+            <w:pPr>
+              <w:jc w:val="center"/>
+            </w:pPr>
+            <w:r>
+              <w:rPr>
+                <w:rFonts w:ascii="Arial" w:hAnsi="Arial" w:eastAsia="Arial"/>
+                <w:b/>
+                <w:color w:val="FFFFFF"/>
+                <w:sz w:val="18"/>
+              </w:rPr>
+              <w:t>Цена за 1 документ, руб.</w:t>
+            </w:r>
+          </w:p>
+        </w:tc>
+        <w:tc>
+          <w:tcPr>
+            <w:tcW w:type="dxa" w:w="3439"/>
+            <w:shd w:fill="1E1E1E" w:val="clear"/>
+          </w:tcPr>
+          <w:p>
+            <w:pPr>
+              <w:jc w:val="center"/>
+            </w:pPr>
+            <w:r>
+              <w:rPr>
+                <w:rFonts w:ascii="Arial" w:hAnsi="Arial" w:eastAsia="Arial"/>
+                <w:b/>
+                <w:color w:val="FFFFFF"/>
+                <w:sz w:val="18"/>
+              </w:rPr>
+              <w:t>Стоимость пакета, руб.</w:t>
+            </w:r>
+          </w:p>
+        </w:tc>
+      </w:tr>
+      <w:tr>
+        <w:tc>
+          <w:tcPr>
+            <w:tcW w:type="dxa" w:w="3439"/>
+            <w:shd w:fill="FFF8E7" w:val="clear"/>
+          </w:tcPr>
+          <w:p>
+            <w:pPr>
+              <w:jc w:val="left"/>
+            </w:pPr>
+            <w:r>
+              <w:rPr>
+                <w:rFonts w:ascii="Arial" w:hAnsi="Arial" w:eastAsia="Arial"/>
+                <w:b/>
+                <w:color w:val="1E1E1E"/>
+                <w:sz w:val="18"/>
+              </w:rPr>
+              <w:t>Пакет на 600 документов</w:t>
+            </w:r>
+          </w:p>
+        </w:tc>
+        <w:tc>
+          <w:tcPr>
+            <w:tcW w:type="dxa" w:w="3439"/>
+            <w:shd w:fill="FFF8E7" w:val="clear"/>
+          </w:tcPr>
+          <w:p>
+            <w:pPr>
+              <w:jc w:val="center"/>
+            </w:pPr>
+            <w:r>
+              <w:rPr>
+                <w:rFonts w:ascii="Arial" w:hAnsi="Arial" w:eastAsia="Arial"/>
+                <w:b w:val="0"/>
+                <w:color w:val="1E1E1E"/>
+                <w:sz w:val="18"/>
+              </w:rPr>
+              <w:t>6,00</w:t>
+            </w:r>
+          </w:p>
+        </w:tc>
+        <w:tc>
+          <w:tcPr>
+            <w:tcW w:type="dxa" w:w="3439"/>
+            <w:shd w:fill="FFF8E7" w:val="clear"/>
+          </w:tcPr>
+          <w:p>
+            <w:pPr>
+              <w:jc w:val="center"/>
+            </w:pPr>
+            <w:r>
+              <w:rPr>
+                <w:rFonts w:ascii="Arial" w:hAnsi="Arial" w:eastAsia="Arial"/>
+                <w:b/>
+                <w:color w:val="1E1E1E"/>
+                <w:sz w:val="18"/>
+              </w:rPr>
+              <w:t>3 600</w:t>
+            </w:r>
+          </w:p>
+        </w:tc>
+      </w:tr>
+      <w:tr>
+        <w:tc>
+          <w:tcPr>
+            <w:tcW w:type="dxa" w:w="3439"/>
+            <w:shd w:fill="FFFFFF" w:val="clear"/>
+          </w:tcPr>
+          <w:p>
+            <w:pPr>
+              <w:jc w:val="left"/>
+            </w:pPr>
+            <w:r>
+              <w:rPr>
+                <w:rFonts w:ascii="Arial" w:hAnsi="Arial" w:eastAsia="Arial"/>
+                <w:b/>
+                <w:color w:val="1E1E1E"/>
+                <w:sz w:val="18"/>
+              </w:rPr>
+              <w:t>Пакет на 1 000 документов</w:t>
+            </w:r>
+          </w:p>
+        </w:tc>
+        <w:tc>
+          <w:tcPr>
+            <w:tcW w:type="dxa" w:w="3439"/>
+            <w:shd w:fill="FFFFFF" w:val="clear"/>
+          </w:tcPr>
+          <w:p>
+            <w:pPr>
+              <w:jc w:val="center"/>
+            </w:pPr>
+            <w:r>
+              <w:rPr>
+                <w:rFonts w:ascii="Arial" w:hAnsi="Arial" w:eastAsia="Arial"/>
+                <w:b w:val="0"/>
+                <w:color w:val="1E1E1E"/>
+                <w:sz w:val="18"/>
+              </w:rPr>
+              <w:t>5,00</w:t>
+            </w:r>
+          </w:p>
+        </w:tc>
+        <w:tc>
+          <w:tcPr>
+            <w:tcW w:type="dxa" w:w="3439"/>
+            <w:shd w:fill="FFFFFF" w:val="clear"/>
+          </w:tcPr>
+          <w:p>
+            <w:pPr>
+              <w:jc w:val="center"/>
+            </w:pPr>
+            <w:r>
+              <w:rPr>
+                <w:rFonts w:ascii="Arial" w:hAnsi="Arial" w:eastAsia="Arial"/>
+                <w:b/>
+                <w:color w:val="1E1E1E"/>
+                <w:sz w:val="18"/>
+              </w:rPr>
+              <w:t>5 000</w:t>
+            </w:r>
+          </w:p>
+        </w:tc>
+      </w:tr>
+      <w:tr>
+        <w:tc>
+          <w:tcPr>
+            <w:tcW w:type="dxa" w:w="3439"/>
+            <w:shd w:fill="FFF8E7" w:val="clear"/>
+          </w:tcPr>
+          <w:p>
+            <w:pPr>
+              <w:jc w:val="left"/>
+            </w:pPr>
+            <w:r>
+              <w:rPr>
+                <w:rFonts w:ascii="Arial" w:hAnsi="Arial" w:eastAsia="Arial"/>
+                <w:b/>
+                <w:color w:val="1E1E1E"/>
+                <w:sz w:val="18"/>
+              </w:rPr>
+              <w:t>Пакет на 5 000 документов</w:t>
+            </w:r>
+          </w:p>
+        </w:tc>
+        <w:tc>
+          <w:tcPr>
+            <w:tcW w:type="dxa" w:w="3439"/>
+            <w:shd w:fill="FFF8E7" w:val="clear"/>
+          </w:tcPr>
+          <w:p>
+            <w:pPr>
+              <w:jc w:val="center"/>
+            </w:pPr>
+            <w:r>
+              <w:rPr>
+                <w:rFonts w:ascii="Arial" w:hAnsi="Arial" w:eastAsia="Arial"/>
+                <w:b w:val="0"/>
+                <w:color w:val="1E1E1E"/>
+                <w:sz w:val="18"/>
+              </w:rPr>
+              <w:t>4,50</w:t>
+            </w:r>
+          </w:p>
+        </w:tc>
+        <w:tc>
+          <w:tcPr>
+            <w:tcW w:type="dxa" w:w="3439"/>
+            <w:shd w:fill="FFF8E7" w:val="clear"/>
+          </w:tcPr>
+          <w:p>
+            <w:pPr>
+              <w:jc w:val="center"/>
+            </w:pPr>
+            <w:r>
+              <w:rPr>
+                <w:rFonts w:ascii="Arial" w:hAnsi="Arial" w:eastAsia="Arial"/>
+                <w:b/>
+                <w:color w:val="1E1E1E"/>
+                <w:sz w:val="18"/>
+              </w:rPr>
+              <w:t>22 500</w:t>
+            </w:r>
+          </w:p>
+        </w:tc>
+      </w:tr>
+      <w:tr>
+        <w:tc>
+          <w:tcPr>
+            <w:tcW w:type="dxa" w:w="3439"/>
+            <w:shd w:fill="FFFFFF" w:val="clear"/>
+          </w:tcPr>
+          <w:p>
+            <w:pPr>
+              <w:jc w:val="left"/>
+            </w:pPr>
+            <w:r>
+              <w:rPr>
+                <w:rFonts w:ascii="Arial" w:hAnsi="Arial" w:eastAsia="Arial"/>
+                <w:b/>
+                <w:color w:val="1E1E1E"/>
+                <w:sz w:val="18"/>
+              </w:rPr>
+              <w:t>Пакет на 10 000 документов</w:t>
+            </w:r>
+          </w:p>
+        </w:tc>
+        <w:tc>
+          <w:tcPr>
+            <w:tcW w:type="dxa" w:w="3439"/>
+            <w:shd w:fill="FFFFFF" w:val="clear"/>
+          </w:tcPr>
+          <w:p>
+            <w:pPr>
+              <w:jc w:val="center"/>
+            </w:pPr>
+            <w:r>
+              <w:rPr>
+                <w:rFonts w:ascii="Arial" w:hAnsi="Arial" w:eastAsia="Arial"/>
+                <w:b w:val="0"/>
+                <w:color w:val="1E1E1E"/>
+                <w:sz w:val="18"/>
+              </w:rPr>
+              <w:t>4,00</w:t>
+            </w:r>
+          </w:p>
+        </w:tc>
+        <w:tc>
+          <w:tcPr>
+            <w:tcW w:type="dxa" w:w="3439"/>
+            <w:shd w:fill="FFFFFF" w:val="clear"/>
+          </w:tcPr>
+          <w:p>
+            <w:pPr>
+              <w:jc w:val="center"/>
+            </w:pPr>
+            <w:r>
+              <w:rPr>
+                <w:rFonts w:ascii="Arial" w:hAnsi="Arial" w:eastAsia="Arial"/>
+                <w:b/>
+                <w:color w:val="1E1E1E"/>
+                <w:sz w:val="18"/>
+              </w:rPr>
+              <w:t>40 000</w:t>
+            </w:r>
+          </w:p>
+        </w:tc>
+      </w:tr>
+      <w:tr>
+        <w:tc>
+          <w:tcPr>
+            <w:tcW w:type="dxa" w:w="3439"/>
+            <w:shd w:fill="FFF8E7" w:val="clear"/>
+          </w:tcPr>
+          <w:p>
+            <w:pPr>
+              <w:jc w:val="left"/>
+            </w:pPr>
+            <w:r>
+              <w:rPr>
+                <w:rFonts w:ascii="Arial" w:hAnsi="Arial" w:eastAsia="Arial"/>
+                <w:b/>
+                <w:color w:val="1E1E1E"/>
+                <w:sz w:val="18"/>
+              </w:rPr>
+              <w:t>Пакет на 50 000 документов</w:t>
+            </w:r>
+          </w:p>
+        </w:tc>
+        <w:tc>
+          <w:tcPr>
+            <w:tcW w:type="dxa" w:w="3439"/>
+            <w:shd w:fill="FFF8E7" w:val="clear"/>
+          </w:tcPr>
+          <w:p>
+            <w:pPr>
+              <w:jc w:val="center"/>
+            </w:pPr>
+            <w:r>
+              <w:rPr>
+                <w:rFonts w:ascii="Arial" w:hAnsi="Arial" w:eastAsia="Arial"/>
+                <w:b w:val="0"/>
+                <w:color w:val="1E1E1E"/>
+                <w:sz w:val="18"/>
+              </w:rPr>
+              <w:t>3,00</w:t>
+            </w:r>
+          </w:p>
+        </w:tc>
+        <w:tc>
+          <w:tcPr>
+            <w:tcW w:type="dxa" w:w="3439"/>
+            <w:shd w:fill="FFF8E7" w:val="clear"/>
+          </w:tcPr>
+          <w:p>
+            <w:pPr>
+              <w:jc w:val="center"/>
+            </w:pPr>
+            <w:r>
+              <w:rPr>
+                <w:rFonts w:ascii="Arial" w:hAnsi="Arial" w:eastAsia="Arial"/>
+                <w:b/>
+                <w:color w:val="1E1E1E"/>
+                <w:sz w:val="18"/>
+              </w:rPr>
+              <w:t>150 000</w:t>
+            </w:r>
+          </w:p>
+        </w:tc>
+      </w:tr>
+      <w:tr>
+        <w:tc>
+          <w:tcPr>
+            <w:tcW w:type="dxa" w:w="3439"/>
+            <w:shd w:fill="FFFFFF" w:val="clear"/>
+          </w:tcPr>
+          <w:p>
+            <w:pPr>
+              <w:jc w:val="left"/>
+            </w:pPr>
+            <w:r>
+              <w:rPr>
+                <w:rFonts w:ascii="Arial" w:hAnsi="Arial" w:eastAsia="Arial"/>
+                <w:b/>
+                <w:color w:val="1E1E1E"/>
+                <w:sz w:val="18"/>
+              </w:rPr>
+              <w:t>Пакет на 100 000 документов</w:t>
+            </w:r>
+          </w:p>
+        </w:tc>
+        <w:tc>
+          <w:tcPr>
+            <w:tcW w:type="dxa" w:w="3439"/>
+            <w:shd w:fill="FFFFFF" w:val="clear"/>
+          </w:tcPr>
+          <w:p>
+            <w:pPr>
+              <w:jc w:val="center"/>
+            </w:pPr>
+            <w:r>
+              <w:rPr>
+                <w:rFonts w:ascii="Arial" w:hAnsi="Arial" w:eastAsia="Arial"/>
+                <w:b w:val="0"/>
+                <w:color w:val="1E1E1E"/>
+                <w:sz w:val="18"/>
+              </w:rPr>
+              <w:t>2,50</w:t>
+            </w:r>
+          </w:p>
+        </w:tc>
+        <w:tc>
+          <w:tcPr>
+            <w:tcW w:type="dxa" w:w="3439"/>
+            <w:shd w:fill="FFFFFF" w:val="clear"/>
+          </w:tcPr>
+          <w:p>
+            <w:pPr>
+              <w:jc w:val="center"/>
+            </w:pPr>
+            <w:r>
+              <w:rPr>
+                <w:rFonts w:ascii="Arial" w:hAnsi="Arial" w:eastAsia="Arial"/>
+                <w:b/>
+                <w:color w:val="1E1E1E"/>
+                <w:sz w:val="18"/>
+              </w:rPr>
+              <w:t>250 000</w:t>
+            </w:r>
+          </w:p>
+        </w:tc>
+      </w:tr>
+    </w:tbl>
+    <w:p>
+      <w:pPr>
+        <w:spacing w:after="120" w:before="80" w:line="288" w:lineRule="auto"/>
+        <w:jc w:val="left"/>
+      </w:pPr>
+      <w:r>
+        <w:rPr>
+          <w:rFonts w:ascii="Arial" w:hAnsi="Arial" w:eastAsia="Arial"/>
+          <w:b w:val="0"/>
+          <w:color w:val="1E1E1E"/>
+          <w:sz w:val="18"/>
+        </w:rPr>
+        <w:t>Акция по 1С-ЭПД: при покупке пакета от 1 000 документов — бесплатная настройка одного рабочего места (активация сервиса, КриптоПро, электронная подпись, машиночитаемая доверенность, приглашение до трёх контрагентов). Лицензия средства криптозащиты и сертификаты электронной подписи оплачиваются отдельно.</w:t>
+      </w:r>
+    </w:p>
+    <w:p>
+      <w:pPr>
+        <w:spacing w:before="240" w:after="120"/>
+        <w:pBdr>
+          <w:bottom w:val="single" w:sz="18" w:space="4" w:color="E8B84A"/>
+        </w:pBdr>
+      </w:pPr>
+      <w:r>
+        <w:rPr>
+          <w:rFonts w:ascii="Arial" w:hAnsi="Arial" w:eastAsia="Arial"/>
+          <w:b/>
+          <w:color w:val="1E1E1E"/>
+          <w:sz w:val="26"/>
         </w:rPr>
         <w:t>Что может понадобиться дополнительно</w:t>
       </w:r>
@@ -2574,7 +3070,7 @@
                 <w:color w:val="FFFFFF"/>
                 <w:sz w:val="18"/>
               </w:rPr>
-              <w:t>Наименование</w:t>
+              <w:t>Услуга или продукт</w:t>
             </w:r>
           </w:p>
         </w:tc>
@@ -2594,7 +3090,7 @@
                 <w:color w:val="FFFFFF"/>
                 <w:sz w:val="18"/>
               </w:rPr>
-              <w:t>Цена</w:t>
+              <w:t>Стоимость</w:t>
             </w:r>
           </w:p>
         </w:tc>
@@ -2614,7 +3110,7 @@
                 <w:color w:val="FFFFFF"/>
                 <w:sz w:val="18"/>
               </w:rPr>
-              <w:t>Комментарий</w:t>
+              <w:t>Для чего нужно</w:t>
             </w:r>
           </w:p>
         </w:tc>
@@ -2636,7 +3132,7 @@
                 <w:color w:val="1E1E1E"/>
                 <w:sz w:val="16"/>
               </w:rPr>
-              <w:t>Линия консультаций 1С (1–3 ч)</w:t>
+              <w:t>Линия консультаций 1С (от 1 до 3 часов)</w:t>
             </w:r>
           </w:p>
         </w:tc>
@@ -2656,7 +3152,7 @@
                 <w:color w:val="1E1E1E"/>
                 <w:sz w:val="16"/>
               </w:rPr>
-              <w:t>3 660 ₽/час</w:t>
+              <w:t>3 660 руб./час</w:t>
             </w:r>
           </w:p>
         </w:tc>
@@ -2676,7 +3172,7 @@
                 <w:color w:val="1E1E1E"/>
                 <w:sz w:val="16"/>
               </w:rPr>
-              <w:t>Удалённая техподдержка и настройка</w:t>
+              <w:t>Удалённая помощь по настройке и вопросам работы</w:t>
             </w:r>
           </w:p>
         </w:tc>
@@ -2698,7 +3194,7 @@
                 <w:color w:val="1E1E1E"/>
                 <w:sz w:val="16"/>
               </w:rPr>
-              <w:t>Подготовка 1 рабочего места 1С-ЭПД</w:t>
+              <w:t>Подготовка одного рабочего места под электронные перевозочные документы</w:t>
             </w:r>
           </w:p>
         </w:tc>
@@ -2718,7 +3214,7 @@
                 <w:color w:val="1E1E1E"/>
                 <w:sz w:val="16"/>
               </w:rPr>
-              <w:t>7 320 ₽</w:t>
+              <w:t>7 320 руб.</w:t>
             </w:r>
           </w:p>
         </w:tc>
@@ -2738,7 +3234,7 @@
                 <w:color w:val="1E1E1E"/>
                 <w:sz w:val="16"/>
               </w:rPr>
-              <w:t>Обучение + настройка / экспресс-анализ</w:t>
+              <w:t>Обучение, экспресс-анализ сценариев, базовая настройка</w:t>
             </w:r>
           </w:p>
         </w:tc>
@@ -2760,7 +3256,7 @@
                 <w:color w:val="1E1E1E"/>
                 <w:sz w:val="16"/>
               </w:rPr>
-              <w:t>Лицензия КриптоПро CSP (бессрочно)</w:t>
+              <w:t>Лицензия КриптоПро CSP (бессрочно, 1 рабочее место)</w:t>
             </w:r>
           </w:p>
         </w:tc>
@@ -2780,7 +3276,7 @@
                 <w:color w:val="1E1E1E"/>
                 <w:sz w:val="16"/>
               </w:rPr>
-              <w:t>3 700 ₽</w:t>
+              <w:t>3 700 руб.</w:t>
             </w:r>
           </w:p>
         </w:tc>
@@ -2800,7 +3296,7 @@
                 <w:color w:val="1E1E1E"/>
                 <w:sz w:val="16"/>
               </w:rPr>
-              <w:t>СКЗИ для работы с ЭП</w:t>
+              <w:t>Программа для работы с электронной подписью</w:t>
             </w:r>
           </w:p>
         </w:tc>
@@ -2822,7 +3318,7 @@
                 <w:color w:val="1E1E1E"/>
                 <w:sz w:val="16"/>
               </w:rPr>
-              <w:t>УКЭП (1С:Подпись)</w:t>
+              <w:t>Усиленная квалифицированная электронная подпись</w:t>
             </w:r>
           </w:p>
         </w:tc>
@@ -2842,7 +3338,7 @@
                 <w:color w:val="1E1E1E"/>
                 <w:sz w:val="16"/>
               </w:rPr>
-              <w:t>1 050 ₽</w:t>
+              <w:t>1 050 руб.</w:t>
             </w:r>
           </w:p>
         </w:tc>
@@ -2862,7 +3358,7 @@
                 <w:color w:val="1E1E1E"/>
                 <w:sz w:val="16"/>
               </w:rPr>
-              <w:t>На каждого подписанта</w:t>
+              <w:t>Выпускается на каждого сотрудника, который подписывает документы</w:t>
             </w:r>
           </w:p>
         </w:tc>
@@ -2884,7 +3380,7 @@
                 <w:color w:val="1E1E1E"/>
                 <w:sz w:val="16"/>
               </w:rPr>
-              <w:t>Рутокен 3.0 / NFC-токен</w:t>
+              <w:t>Рутокен 3.0 или NFC-токен для подписи</w:t>
             </w:r>
           </w:p>
         </w:tc>
@@ -2904,7 +3400,7 @@
                 <w:color w:val="1E1E1E"/>
                 <w:sz w:val="16"/>
               </w:rPr>
-              <w:t>от 2 700 ₽</w:t>
+              <w:t>от 2 700 руб.</w:t>
             </w:r>
           </w:p>
         </w:tc>
@@ -2924,7 +3420,7 @@
                 <w:color w:val="1E1E1E"/>
                 <w:sz w:val="16"/>
               </w:rPr>
-              <w:t>Носитель для мобильного подписания</w:t>
+              <w:t>Носитель подписи; NFC нужен для подписания с телефона</w:t>
             </w:r>
           </w:p>
         </w:tc>
@@ -2966,7 +3462,7 @@
                 <w:color w:val="1E1E1E"/>
                 <w:sz w:val="16"/>
               </w:rPr>
-              <w:t>от 3 273 ₽/мес.</w:t>
+              <w:t>от 3 273 руб./мес.</w:t>
             </w:r>
           </w:p>
         </w:tc>
@@ -2986,7 +3482,7 @@
                 <w:color w:val="1E1E1E"/>
                 <w:sz w:val="16"/>
               </w:rPr>
-              <w:t>Сопровождение и обновления 1С</w:t>
+              <w:t>Сопровождение и обновление программ 1С</w:t>
             </w:r>
           </w:p>
         </w:tc>
@@ -2994,7 +3490,395 @@
     </w:tbl>
     <w:p>
       <w:pPr>
-        <w:spacing w:before="200" w:after="0"/>
+        <w:spacing w:before="240" w:after="120"/>
+        <w:pBdr>
+          <w:bottom w:val="single" w:sz="18" w:space="4" w:color="E8B84A"/>
+        </w:pBdr>
+      </w:pPr>
+      <w:r>
+        <w:rPr>
+          <w:rFonts w:ascii="Arial" w:hAnsi="Arial" w:eastAsia="Arial"/>
+          <w:b/>
+          <w:color w:val="1E1E1E"/>
+          <w:sz w:val="26"/>
+        </w:rPr>
+        <w:t>Почему Форус</w:t>
+      </w:r>
+    </w:p>
+    <w:tbl>
+      <w:tblPr>
+        <w:tblW w:type="auto" w:w="0"/>
+        <w:tblLook w:firstColumn="1" w:firstRow="1" w:lastColumn="0" w:lastRow="0" w:noHBand="0" w:noVBand="1" w:val="04A0"/>
+        <w:tblBorders>
+          <w:top w:val="single" w:sz="12" w:space="0" w:color="E8B84A"/>
+          <w:left w:val="single" w:sz="12" w:space="0" w:color="E8B84A"/>
+          <w:bottom w:val="single" w:sz="12" w:space="0" w:color="E8B84A"/>
+          <w:right w:val="single" w:sz="12" w:space="0" w:color="E8B84A"/>
+          <w:insideH w:val="single" w:sz="12" w:space="0" w:color="E8B84A"/>
+          <w:insideV w:val="single" w:sz="12" w:space="0" w:color="E8B84A"/>
+        </w:tblBorders>
+      </w:tblPr>
+      <w:tblGrid>
+        <w:gridCol w:w="10318"/>
+      </w:tblGrid>
+      <w:tr>
+        <w:tc>
+          <w:tcPr>
+            <w:tcW w:type="dxa" w:w="10318"/>
+            <w:shd w:fill="FFF8E7" w:val="clear"/>
+          </w:tcPr>
+          <w:p>
+            <w:r>
+              <w:rPr>
+                <w:rFonts w:ascii="Arial" w:hAnsi="Arial" w:eastAsia="Arial"/>
+                <w:b/>
+                <w:color w:val="1E1E1E"/>
+                <w:sz w:val="22"/>
+              </w:rPr>
+              <w:t>Группа компаний «Форус»</w:t>
+            </w:r>
+          </w:p>
+          <w:p>
+            <w:pPr>
+              <w:spacing w:before="60"/>
+            </w:pPr>
+            <w:r>
+              <w:rPr>
+                <w:rFonts w:ascii="Arial" w:hAnsi="Arial" w:eastAsia="Arial"/>
+                <w:b w:val="0"/>
+                <w:color w:val="1E1E1E"/>
+                <w:sz w:val="18"/>
+              </w:rPr>
+              <w:t>Крупнейшая IT-компания Иркутской области, на рынке с 1992 года. Входим в ТОП-50 крупнейших IT-компаний России. В штате более 300 сертифицированных специалистов. Первые в рейтинге фирмы «1С» по числу аттестованных специалистов по «1С:Предприятие 8» в Иркутской области. Система менеджмента качества соответствует международному стандарту ISO 9001.</w:t>
+            </w:r>
+          </w:p>
+        </w:tc>
+      </w:tr>
+    </w:tbl>
+    <w:tbl>
+      <w:tblPr>
+        <w:tblW w:type="auto" w:w="0"/>
+        <w:tblLook w:firstColumn="1" w:firstRow="1" w:lastColumn="0" w:lastRow="0" w:noHBand="0" w:noVBand="1" w:val="04A0"/>
+        <w:tblBorders>
+          <w:top w:val="single" w:sz="4" w:space="0" w:color="DDDDDD"/>
+          <w:left w:val="single" w:sz="4" w:space="0" w:color="DDDDDD"/>
+          <w:bottom w:val="single" w:sz="4" w:space="0" w:color="DDDDDD"/>
+          <w:right w:val="single" w:sz="4" w:space="0" w:color="DDDDDD"/>
+          <w:insideH w:val="single" w:sz="4" w:space="0" w:color="DDDDDD"/>
+          <w:insideV w:val="single" w:sz="4" w:space="0" w:color="DDDDDD"/>
+        </w:tblBorders>
+      </w:tblPr>
+      <w:tblGrid>
+        <w:gridCol w:w="3439"/>
+        <w:gridCol w:w="3439"/>
+        <w:gridCol w:w="3439"/>
+      </w:tblGrid>
+      <w:tr>
+        <w:tc>
+          <w:tcPr>
+            <w:tcW w:type="dxa" w:w="3439"/>
+            <w:shd w:fill="FFFFFF" w:val="clear"/>
+          </w:tcPr>
+          <w:p>
+            <w:pPr>
+              <w:jc w:val="center"/>
+            </w:pPr>
+            <w:r>
+              <w:rPr>
+                <w:rFonts w:ascii="Arial" w:hAnsi="Arial" w:eastAsia="Arial"/>
+                <w:b/>
+                <w:color w:val="E8B84A"/>
+                <w:sz w:val="16"/>
+              </w:rPr>
+              <w:t xml:space="preserve">● </w:t>
+            </w:r>
+            <w:r>
+              <w:rPr>
+                <w:rFonts w:ascii="Arial" w:hAnsi="Arial" w:eastAsia="Arial"/>
+                <w:b/>
+                <w:color w:val="1E1E1E"/>
+                <w:sz w:val="16"/>
+              </w:rPr>
+              <w:t>1С: Центр ERP</w:t>
+            </w:r>
+          </w:p>
+        </w:tc>
+        <w:tc>
+          <w:tcPr>
+            <w:tcW w:type="dxa" w:w="3439"/>
+            <w:shd w:fill="FFFFFF" w:val="clear"/>
+          </w:tcPr>
+          <w:p>
+            <w:pPr>
+              <w:jc w:val="center"/>
+            </w:pPr>
+            <w:r>
+              <w:rPr>
+                <w:rFonts w:ascii="Arial" w:hAnsi="Arial" w:eastAsia="Arial"/>
+                <w:b/>
+                <w:color w:val="E8B84A"/>
+                <w:sz w:val="16"/>
+              </w:rPr>
+              <w:t xml:space="preserve">● </w:t>
+            </w:r>
+            <w:r>
+              <w:rPr>
+                <w:rFonts w:ascii="Arial" w:hAnsi="Arial" w:eastAsia="Arial"/>
+                <w:b/>
+                <w:color w:val="1E1E1E"/>
+                <w:sz w:val="16"/>
+              </w:rPr>
+              <w:t>Центр сопровождения 1С</w:t>
+            </w:r>
+          </w:p>
+        </w:tc>
+        <w:tc>
+          <w:tcPr>
+            <w:tcW w:type="dxa" w:w="3439"/>
+            <w:shd w:fill="FFFFFF" w:val="clear"/>
+          </w:tcPr>
+          <w:p>
+            <w:pPr>
+              <w:jc w:val="center"/>
+            </w:pPr>
+            <w:r>
+              <w:rPr>
+                <w:rFonts w:ascii="Arial" w:hAnsi="Arial" w:eastAsia="Arial"/>
+                <w:b/>
+                <w:color w:val="E8B84A"/>
+                <w:sz w:val="16"/>
+              </w:rPr>
+              <w:t xml:space="preserve">● </w:t>
+            </w:r>
+            <w:r>
+              <w:rPr>
+                <w:rFonts w:ascii="Arial" w:hAnsi="Arial" w:eastAsia="Arial"/>
+                <w:b/>
+                <w:color w:val="1E1E1E"/>
+                <w:sz w:val="16"/>
+              </w:rPr>
+              <w:t>Центр компетенции 1С: КОРП</w:t>
+            </w:r>
+          </w:p>
+        </w:tc>
+      </w:tr>
+      <w:tr>
+        <w:tc>
+          <w:tcPr>
+            <w:tcW w:type="dxa" w:w="3439"/>
+            <w:shd w:fill="FFFFFF" w:val="clear"/>
+          </w:tcPr>
+          <w:p>
+            <w:pPr>
+              <w:jc w:val="center"/>
+            </w:pPr>
+            <w:r>
+              <w:rPr>
+                <w:rFonts w:ascii="Arial" w:hAnsi="Arial" w:eastAsia="Arial"/>
+                <w:b/>
+                <w:color w:val="E8B84A"/>
+                <w:sz w:val="16"/>
+              </w:rPr>
+              <w:t xml:space="preserve">● </w:t>
+            </w:r>
+            <w:r>
+              <w:rPr>
+                <w:rFonts w:ascii="Arial" w:hAnsi="Arial" w:eastAsia="Arial"/>
+                <w:b/>
+                <w:color w:val="1E1E1E"/>
+                <w:sz w:val="16"/>
+              </w:rPr>
+              <w:t>Центр реальной автоматизации</w:t>
+            </w:r>
+          </w:p>
+        </w:tc>
+        <w:tc>
+          <w:tcPr>
+            <w:tcW w:type="dxa" w:w="3439"/>
+            <w:shd w:fill="FFFFFF" w:val="clear"/>
+          </w:tcPr>
+          <w:p>
+            <w:pPr>
+              <w:jc w:val="center"/>
+            </w:pPr>
+            <w:r>
+              <w:rPr>
+                <w:rFonts w:ascii="Arial" w:hAnsi="Arial" w:eastAsia="Arial"/>
+                <w:b/>
+                <w:color w:val="E8B84A"/>
+                <w:sz w:val="16"/>
+              </w:rPr>
+              <w:t xml:space="preserve">● </w:t>
+            </w:r>
+            <w:r>
+              <w:rPr>
+                <w:rFonts w:ascii="Arial" w:hAnsi="Arial" w:eastAsia="Arial"/>
+                <w:b/>
+                <w:color w:val="1E1E1E"/>
+                <w:sz w:val="16"/>
+              </w:rPr>
+              <w:t>Центр компетенции по документообороту</w:t>
+            </w:r>
+          </w:p>
+        </w:tc>
+        <w:tc>
+          <w:tcPr>
+            <w:tcW w:type="dxa" w:w="3439"/>
+            <w:shd w:fill="FFFFFF" w:val="clear"/>
+          </w:tcPr>
+          <w:p>
+            <w:pPr>
+              <w:jc w:val="center"/>
+            </w:pPr>
+            <w:r>
+              <w:rPr>
+                <w:rFonts w:ascii="Arial" w:hAnsi="Arial" w:eastAsia="Arial"/>
+                <w:b/>
+                <w:color w:val="E8B84A"/>
+                <w:sz w:val="16"/>
+              </w:rPr>
+              <w:t xml:space="preserve">● </w:t>
+            </w:r>
+            <w:r>
+              <w:rPr>
+                <w:rFonts w:ascii="Arial" w:hAnsi="Arial" w:eastAsia="Arial"/>
+                <w:b/>
+                <w:color w:val="1E1E1E"/>
+                <w:sz w:val="16"/>
+              </w:rPr>
+              <w:t>Центр компетенции по кадровому электронному документообороту</w:t>
+            </w:r>
+          </w:p>
+        </w:tc>
+      </w:tr>
+    </w:tbl>
+    <w:p>
+      <w:pPr>
+        <w:spacing w:after="120" w:before="120" w:line="288" w:lineRule="auto"/>
+        <w:jc w:val="left"/>
+      </w:pPr>
+      <w:r>
+        <w:rPr>
+          <w:rFonts w:ascii="Arial" w:hAnsi="Arial" w:eastAsia="Arial"/>
+          <w:b w:val="0"/>
+          <w:color w:val="1E1E1E"/>
+          <w:sz w:val="18"/>
+        </w:rPr>
+        <w:t>Мы не просто продаём доступ к сервису: помогаем выбрать решение под ваши процессы, настраиваем рабочее место, выпускаем электронные подписи, обучаем сотрудников и сопровождаем после запуска. Вы всегда можете обратиться к персональному менеджеру и на линию консультаций Форус.</w:t>
+      </w:r>
+    </w:p>
+    <w:p>
+      <w:pPr>
+        <w:spacing w:before="240" w:after="120"/>
+        <w:pBdr>
+          <w:bottom w:val="single" w:sz="18" w:space="4" w:color="E8B84A"/>
+        </w:pBdr>
+      </w:pPr>
+      <w:r>
+        <w:rPr>
+          <w:rFonts w:ascii="Arial" w:hAnsi="Arial" w:eastAsia="Arial"/>
+          <w:b/>
+          <w:color w:val="1E1E1E"/>
+          <w:sz w:val="26"/>
+        </w:rPr>
+        <w:t>Как начать работу</w:t>
+      </w:r>
+    </w:p>
+    <w:p>
+      <w:pPr>
+        <w:spacing w:after="60"/>
+      </w:pPr>
+      <w:r>
+        <w:rPr>
+          <w:rFonts w:ascii="Arial" w:hAnsi="Arial" w:eastAsia="Arial"/>
+          <w:b/>
+          <w:color w:val="E8B84A"/>
+          <w:sz w:val="20"/>
+        </w:rPr>
+        <w:t xml:space="preserve">1. </w:t>
+      </w:r>
+      <w:r>
+        <w:rPr>
+          <w:rFonts w:ascii="Arial" w:hAnsi="Arial" w:eastAsia="Arial"/>
+          <w:b w:val="0"/>
+          <w:color w:val="1E1E1E"/>
+          <w:sz w:val="20"/>
+        </w:rPr>
+        <w:t>Короткий созвон или встреча: уточняем ваши сценарии перевозок и объём документов.</w:t>
+      </w:r>
+    </w:p>
+    <w:p>
+      <w:pPr>
+        <w:spacing w:after="60"/>
+      </w:pPr>
+      <w:r>
+        <w:rPr>
+          <w:rFonts w:ascii="Arial" w:hAnsi="Arial" w:eastAsia="Arial"/>
+          <w:b/>
+          <w:color w:val="E8B84A"/>
+          <w:sz w:val="20"/>
+        </w:rPr>
+        <w:t xml:space="preserve">2. </w:t>
+      </w:r>
+      <w:r>
+        <w:rPr>
+          <w:rFonts w:ascii="Arial" w:hAnsi="Arial" w:eastAsia="Arial"/>
+          <w:b w:val="0"/>
+          <w:color w:val="1E1E1E"/>
+          <w:sz w:val="20"/>
+        </w:rPr>
+        <w:t>Подбираем пакет Доки.Логистика (или 1С-ЭПД, если это ваш осознанный выбор) и считаем итоговую стоимость.</w:t>
+      </w:r>
+    </w:p>
+    <w:p>
+      <w:pPr>
+        <w:spacing w:after="60"/>
+      </w:pPr>
+      <w:r>
+        <w:rPr>
+          <w:rFonts w:ascii="Arial" w:hAnsi="Arial" w:eastAsia="Arial"/>
+          <w:b/>
+          <w:color w:val="E8B84A"/>
+          <w:sz w:val="20"/>
+        </w:rPr>
+        <w:t xml:space="preserve">3. </w:t>
+      </w:r>
+      <w:r>
+        <w:rPr>
+          <w:rFonts w:ascii="Arial" w:hAnsi="Arial" w:eastAsia="Arial"/>
+          <w:b w:val="0"/>
+          <w:color w:val="1E1E1E"/>
+          <w:sz w:val="20"/>
+        </w:rPr>
+        <w:t>Подключаем сервис, настраиваем подписи и права доступа, приглашаем ключевых контрагентов.</w:t>
+      </w:r>
+    </w:p>
+    <w:p>
+      <w:pPr>
+        <w:spacing w:after="60"/>
+      </w:pPr>
+      <w:r>
+        <w:rPr>
+          <w:rFonts w:ascii="Arial" w:hAnsi="Arial" w:eastAsia="Arial"/>
+          <w:b/>
+          <w:color w:val="E8B84A"/>
+          <w:sz w:val="20"/>
+        </w:rPr>
+        <w:t xml:space="preserve">4. </w:t>
+      </w:r>
+      <w:r>
+        <w:rPr>
+          <w:rFonts w:ascii="Arial" w:hAnsi="Arial" w:eastAsia="Arial"/>
+          <w:b w:val="0"/>
+          <w:color w:val="1E1E1E"/>
+          <w:sz w:val="20"/>
+        </w:rPr>
+        <w:t>Обучаем сотрудников и сопровождаем на старте, чтобы обмен пошёл без сбоев.</w:t>
+      </w:r>
+    </w:p>
+    <w:p>
+      <w:pPr>
+        <w:spacing w:before="200" w:after="160"/>
         <w:pBdr>
           <w:bottom w:val="single" w:sz="24" w:space="1" w:color="E8B84A"/>
         </w:pBdr>
@@ -3049,17 +3933,14 @@
             </w:r>
           </w:p>
           <w:p>
-            <w:pPr>
-              <w:spacing w:before="0"/>
-            </w:pPr>
             <w:r>
               <w:rPr>
                 <w:rFonts w:ascii="Arial" w:hAnsi="Arial" w:eastAsia="Arial"/>
                 <w:b w:val="0"/>
                 <w:color w:val="1E1E1E"/>
-                <w:sz w:val="18"/>
+                <w:sz w:val="16"/>
               </w:rPr>
-              <w:t>Менеджер по продаже 1С-ЭПД</w:t>
+              <w:t>Менеджер по продаже решений для электронных перевозочных документов</w:t>
             </w:r>
           </w:p>
           <w:p>
@@ -3073,7 +3954,7 @@
                 <w:color w:val="1E1E1E"/>
                 <w:sz w:val="18"/>
               </w:rPr>
-              <w:t>E-mail: sogloblina@forus.ru</w:t>
+              <w:t>Электронная почта: sogloblina@forus.ru</w:t>
             </w:r>
           </w:p>
           <w:p>
@@ -3087,7 +3968,7 @@
                 <w:color w:val="1E1E1E"/>
                 <w:sz w:val="18"/>
               </w:rPr>
-              <w:t>Тел.: +7 (3952) 78-00-00, доб. 1861</w:t>
+              <w:t>Телефон: +7 (3952) 78-00-00, доб. 1861</w:t>
             </w:r>
           </w:p>
           <w:p>
@@ -3101,7 +3982,7 @@
                 <w:color w:val="1E1E1E"/>
                 <w:sz w:val="18"/>
               </w:rPr>
-              <w:t>Москва +5 часов</w:t>
+              <w:t>Разница со временем Москвы: +5 часов</w:t>
             </w:r>
           </w:p>
         </w:tc>
@@ -3118,7 +3999,7 @@
                 <w:color w:val="555555"/>
                 <w:sz w:val="18"/>
               </w:rPr>
-              <w:t>Контакты ГК «Форус»</w:t>
+              <w:t>Контакты группы компаний «Форус»</w:t>
             </w:r>
           </w:p>
           <w:p>
@@ -3160,7 +4041,7 @@
                 <w:color w:val="1E1E1E"/>
                 <w:sz w:val="18"/>
               </w:rPr>
-              <w:t>Тел.: +7 (3952) 78-00-00, 72-87-02</w:t>
+              <w:t>Телефон: +7 (3952) 78-00-00, 72-87-02</w:t>
             </w:r>
           </w:p>
           <w:p>
@@ -3174,7 +4055,7 @@
                 <w:color w:val="1E1E1E"/>
                 <w:sz w:val="18"/>
               </w:rPr>
-              <w:t>E-mail: info@forus.ru</w:t>
+              <w:t>Электронная почта: info@forus.ru</w:t>
             </w:r>
           </w:p>
           <w:p>
@@ -3220,9 +4101,9 @@
           <w:color w:val="555555"/>
           <w:sz w:val="18"/>
         </w:rPr>
-        <w:t>Готовы подобрать оптимальный пакет и провести демонстрацию сервиса.</w:t>
+        <w:t>Готовы подобрать пакет под ваш объём документов и провести демонстрацию Доки.Логистика.</w:t>
         <w:br/>
-        <w:t>Ожидаем обратную связь и надеемся на плодотворное сотрудничество!</w:t>
+        <w:t>Будем рады ответить на вопросы и помочь с быстрым запуском.</w:t>
       </w:r>
     </w:p>
     <w:sectPr>

</xml_diff>

<commit_message>
Clarify remaining product-name abbreviations in KP text
Co-authored-by: slitasov <slitasov@users.noreply.github.com>
</commit_message>
<xml_diff>
--- a/output/КП_1С-ЭПД_и_Доки_Логистика.docx
+++ b/output/КП_1С-ЭПД_и_Доки_Логистика.docx
@@ -1218,7 +1218,7 @@
                 <w:color w:val="1E1E1E"/>
                 <w:sz w:val="16"/>
               </w:rPr>
-              <w:t>Нужна база 1С (или бесплатная конфигурация «1С:Клиент ЭДО»)</w:t>
+              <w:t>Нужна база 1С (или бесплатная программа «1С:Клиент ЭДО» для обмена документами)</w:t>
             </w:r>
           </w:p>
         </w:tc>
@@ -2512,7 +2512,7 @@
                 <w:color w:val="1E1E1E"/>
                 <w:sz w:val="18"/>
               </w:rPr>
-              <w:t>При покупке любого пакета Доки и 1 часа линии консультаций за 3 660 рублей мы даём дополнительно 3 месяца демо-доступа. Сначала вы пользуетесь демо-периодом, затем автоматически активируется оплаченный пакет. Итого — 15 месяцев работы вместо 12. Промотариф на 3 месяца безлимита доступен новым клиентам (не применяется, если уже есть учётная запись в сервисе Астрал.ЭДО).</w:t>
+              <w:t>При покупке любого пакета Доки и 1 часа линии консультаций за 3 660 рублей мы даём дополнительно 3 месяца демо-доступа. Сначала вы пользуетесь демо-периодом, затем автоматически активируется оплаченный пакет. Итого — 15 месяцев работы вместо 12. Промотариф на 3 месяца безлимита доступен новым клиентам (не применяется, если у вас уже есть учётная запись в связанном сервисе Астрал.ЭДО).</w:t>
             </w:r>
           </w:p>
         </w:tc>

</xml_diff>